<commit_message>
Match HR Word templates to supplied 2026 PDF forms
</commit_message>
<xml_diff>
--- a/backend/templates/GSSG-HR_300-001_Manpower_Requisition_Form.docx
+++ b/backend/templates/GSSG-HR_300-001_Manpower_Requisition_Form.docx
@@ -4,580 +4,4137 @@
   <w:body>
     <w:p>
       <w:pPr>
-        <w:jc w:val="center"/>
+        <w:autoSpaceDN w:val="0"/>
+        <w:autoSpaceDE w:val="0"/>
+        <w:widowControl/>
+        <w:spacing w:line="220" w:lineRule="exact" w:before="0" w:after="80"/>
+        <w:ind w:left="0" w:right="0"/>
       </w:pPr>
-      <w:r>
-        <w:rPr>
-          <w:b/>
-          <w:sz w:val="28"/>
-        </w:rPr>
-        <w:t>Global Security Services Group</w:t>
-        <w:br/>
-        <w:t>Manpower Requisition Form</w:t>
-        <w:br/>
-        <w:t>GSSG-HR 300-001</w:t>
-      </w:r>
-    </w:p>
-    <w:p>
-      <w:r>
-        <w:rPr>
-          <w:i/>
-        </w:rPr>
-        <w:t>Proposed template — awaiting review. Source issue date 21-09-2026. Generated from the GSSG-HR PDF intake for in-app tokenized filling.</w:t>
-      </w:r>
     </w:p>
     <w:tbl>
       <w:tblPr>
-        <w:tblStyle w:val="TableGrid"/>
         <w:tblW w:type="auto" w:w="0"/>
+        <w:tblLayout w:type="fixed"/>
         <w:tblLook w:firstColumn="1" w:firstRow="1" w:lastColumn="0" w:lastRow="0" w:noHBand="0" w:noVBand="1" w:val="04A0"/>
+        <w:tblInd w:w="400.0" w:type="dxa"/>
       </w:tblPr>
       <w:tblGrid>
-        <w:gridCol w:w="4320"/>
-        <w:gridCol w:w="4320"/>
+        <w:gridCol w:w="2256"/>
+        <w:gridCol w:w="2256"/>
+        <w:gridCol w:w="2256"/>
+        <w:gridCol w:w="2256"/>
       </w:tblGrid>
       <w:tr>
+        <w:trPr>
+          <w:trHeight w:hRule="exact" w:val="260"/>
+        </w:trPr>
         <w:tc>
           <w:tcPr>
-            <w:tcW w:type="dxa" w:w="4320"/>
+            <w:tcW w:type="dxa" w:w="3380"/>
+            <w:vMerge w:val="restart"/>
+            <w:tcBorders/>
+            <w:tcMar>
+              <w:start w:w="0" w:type="dxa"/>
+              <w:end w:w="0" w:type="dxa"/>
+            </w:tcMar>
+            <w:tcMar>
+              <w:start w:w="0" w:type="dxa"/>
+              <w:end w:w="0" w:type="dxa"/>
+            </w:tcMar>
+            <w:tcMar>
+              <w:start w:w="0" w:type="dxa"/>
+              <w:end w:w="0" w:type="dxa"/>
+            </w:tcMar>
+            <w:tcMar>
+              <w:start w:w="0" w:type="dxa"/>
+              <w:end w:w="0" w:type="dxa"/>
+            </w:tcMar>
           </w:tcPr>
           <w:p>
+            <w:pPr>
+              <w:autoSpaceDN w:val="0"/>
+              <w:autoSpaceDE w:val="0"/>
+              <w:widowControl/>
+              <w:spacing w:line="240" w:lineRule="auto" w:before="40" w:after="0"/>
+              <w:ind w:left="400" w:right="0" w:firstLine="0"/>
+              <w:jc w:val="left"/>
+            </w:pPr>
             <w:r>
-              <w:t>Job Title / Designation / المسمى الوظيفي</w:t>
+              <w:drawing>
+                <wp:inline xmlns:a="http://schemas.openxmlformats.org/drawingml/2006/main" xmlns:pic="http://schemas.openxmlformats.org/drawingml/2006/picture">
+                  <wp:extent cx="1727200" cy="571500"/>
+                  <wp:docPr id="1" name="Picture 1"/>
+                  <wp:cNvGraphicFramePr>
+                    <a:graphicFrameLocks noChangeAspect="1"/>
+                  </wp:cNvGraphicFramePr>
+                  <a:graphic>
+                    <a:graphicData uri="http://schemas.openxmlformats.org/drawingml/2006/picture">
+                      <pic:pic>
+                        <pic:nvPicPr>
+                          <pic:cNvPr id="0" name="image.png"/>
+                          <pic:cNvPicPr/>
+                        </pic:nvPicPr>
+                        <pic:blipFill>
+                          <a:blip r:embed="rId9"/>
+                          <a:stretch>
+                            <a:fillRect/>
+                          </a:stretch>
+                        </pic:blipFill>
+                        <pic:spPr>
+                          <a:xfrm>
+                            <a:off x="0" y="0"/>
+                            <a:ext cx="1727200" cy="571500"/>
+                          </a:xfrm>
+                          <a:prstGeom prst="rect"/>
+                        </pic:spPr>
+                      </pic:pic>
+                    </a:graphicData>
+                  </a:graphic>
+                </wp:inline>
+              </w:drawing>
             </w:r>
           </w:p>
         </w:tc>
         <w:tc>
           <w:tcPr>
-            <w:tcW w:type="dxa" w:w="4320"/>
+            <w:tcW w:type="dxa" w:w="4060"/>
+            <w:vMerge w:val="restart"/>
+            <w:tcBorders/>
+            <w:tcMar>
+              <w:start w:w="0" w:type="dxa"/>
+              <w:end w:w="0" w:type="dxa"/>
+            </w:tcMar>
+            <w:tcMar>
+              <w:start w:w="0" w:type="dxa"/>
+              <w:end w:w="0" w:type="dxa"/>
+            </w:tcMar>
+          </w:tcPr>
+          <w:p>
+            <w:pPr>
+              <w:autoSpaceDN w:val="0"/>
+              <w:autoSpaceDE w:val="0"/>
+              <w:widowControl/>
+              <w:spacing w:line="230" w:lineRule="auto" w:before="0" w:after="0"/>
+              <w:ind w:left="286" w:right="0" w:firstLine="0"/>
+              <w:jc w:val="left"/>
+            </w:pPr>
+            <w:r>
+              <w:rPr>
+                <w:rFonts w:ascii="Univers" w:hAnsi="Univers" w:eastAsia="Univers"/>
+                <w:b/>
+                <w:i w:val="0"/>
+                <w:color w:val="000000"/>
+                <w:sz w:val="24"/>
+              </w:rPr>
+              <w:t xml:space="preserve">Global Security Services Group </w:t>
+            </w:r>
+          </w:p>
+        </w:tc>
+        <w:tc>
+          <w:tcPr>
+            <w:tcW w:type="dxa" w:w="1700"/>
+            <w:vMerge w:val="restart"/>
+            <w:tcBorders/>
+            <w:tcMar>
+              <w:start w:w="0" w:type="dxa"/>
+              <w:end w:w="0" w:type="dxa"/>
+            </w:tcMar>
+            <w:tcMar>
+              <w:start w:w="0" w:type="dxa"/>
+              <w:end w:w="0" w:type="dxa"/>
+            </w:tcMar>
+          </w:tcPr>
+          <w:p>
+            <w:pPr>
+              <w:autoSpaceDN w:val="0"/>
+              <w:autoSpaceDE w:val="0"/>
+              <w:widowControl/>
+              <w:spacing w:line="197" w:lineRule="auto" w:before="48" w:after="0"/>
+              <w:ind w:left="0" w:right="0" w:firstLine="0"/>
+              <w:jc w:val="center"/>
+            </w:pPr>
+            <w:r>
+              <w:rPr>
+                <w:rFonts w:ascii="Calibri" w:hAnsi="Calibri" w:eastAsia="Calibri"/>
+                <w:b/>
+                <w:i w:val="0"/>
+                <w:color w:val="000000"/>
+                <w:sz w:val="24"/>
+              </w:rPr>
+              <w:t xml:space="preserve">Date of Issue </w:t>
+            </w:r>
+          </w:p>
+        </w:tc>
+        <w:tc>
+          <w:tcPr>
+            <w:tcW w:type="dxa" w:w="1820"/>
+            <w:tcBorders/>
+            <w:tcMar>
+              <w:start w:w="0" w:type="dxa"/>
+              <w:end w:w="0" w:type="dxa"/>
+            </w:tcMar>
+          </w:tcPr>
+          <w:p>
+            <w:pPr>
+              <w:autoSpaceDN w:val="0"/>
+              <w:autoSpaceDE w:val="0"/>
+              <w:widowControl/>
+              <w:spacing w:line="197" w:lineRule="auto" w:before="40" w:after="0"/>
+              <w:ind w:left="196" w:right="0" w:firstLine="0"/>
+              <w:jc w:val="left"/>
+            </w:pPr>
+            <w:r>
+              <w:rPr>
+                <w:rFonts w:ascii="Calibri" w:hAnsi="Calibri" w:eastAsia="Calibri"/>
+                <w:b w:val="0"/>
+                <w:i w:val="0"/>
+                <w:color w:val="000000"/>
+                <w:sz w:val="22"/>
+              </w:rPr>
+              <w:t xml:space="preserve">21-09-2026 </w:t>
+            </w:r>
+          </w:p>
+        </w:tc>
+      </w:tr>
+      <w:tr>
+        <w:trPr>
+          <w:trHeight w:hRule="exact" w:val="83"/>
+        </w:trPr>
+        <w:tc>
+          <w:tcPr>
+            <w:tcW w:type="dxa" w:w="2256"/>
+            <w:vMerge/>
+            <w:tcBorders/>
+          </w:tcPr>
+          <w:p/>
+        </w:tc>
+        <w:tc>
+          <w:tcPr>
+            <w:tcW w:type="dxa" w:w="2256"/>
+            <w:vMerge/>
+            <w:tcBorders/>
+          </w:tcPr>
+          <w:p/>
+        </w:tc>
+        <w:tc>
+          <w:tcPr>
+            <w:tcW w:type="dxa" w:w="2256"/>
+            <w:vMerge/>
+            <w:tcBorders/>
+          </w:tcPr>
+          <w:p/>
+        </w:tc>
+        <w:tc>
+          <w:tcPr>
+            <w:tcW w:type="dxa" w:w="1820"/>
+            <w:vMerge w:val="restart"/>
+            <w:tcBorders/>
+            <w:tcMar>
+              <w:start w:w="0" w:type="dxa"/>
+              <w:end w:w="0" w:type="dxa"/>
+            </w:tcMar>
+            <w:tcMar>
+              <w:start w:w="0" w:type="dxa"/>
+              <w:end w:w="0" w:type="dxa"/>
+            </w:tcMar>
+          </w:tcPr>
+          <w:p>
+            <w:pPr>
+              <w:autoSpaceDN w:val="0"/>
+              <w:autoSpaceDE w:val="0"/>
+              <w:widowControl/>
+              <w:spacing w:line="197" w:lineRule="auto" w:before="136" w:after="0"/>
+              <w:ind w:left="196" w:right="0" w:firstLine="0"/>
+              <w:jc w:val="left"/>
+            </w:pPr>
+            <w:r>
+              <w:rPr>
+                <w:rFonts w:ascii="Calibri" w:hAnsi="Calibri" w:eastAsia="Calibri"/>
+                <w:b w:val="0"/>
+                <w:i w:val="0"/>
+                <w:color w:val="000000"/>
+                <w:sz w:val="22"/>
+              </w:rPr>
+              <w:t xml:space="preserve">02 </w:t>
+            </w:r>
+          </w:p>
+        </w:tc>
+      </w:tr>
+      <w:tr>
+        <w:trPr>
+          <w:trHeight w:hRule="exact" w:val="277"/>
+        </w:trPr>
+        <w:tc>
+          <w:tcPr>
+            <w:tcW w:type="dxa" w:w="2256"/>
+            <w:vMerge/>
+            <w:tcBorders/>
+          </w:tcPr>
+          <w:p/>
+        </w:tc>
+        <w:tc>
+          <w:tcPr>
+            <w:tcW w:type="dxa" w:w="4060"/>
+            <w:tcBorders/>
+            <w:tcMar>
+              <w:start w:w="0" w:type="dxa"/>
+              <w:end w:w="0" w:type="dxa"/>
+            </w:tcMar>
+          </w:tcPr>
+          <w:p>
+            <w:pPr>
+              <w:autoSpaceDN w:val="0"/>
+              <w:autoSpaceDE w:val="0"/>
+              <w:widowControl/>
+              <w:spacing w:line="197" w:lineRule="auto" w:before="36" w:after="0"/>
+              <w:ind w:left="286" w:right="0" w:firstLine="0"/>
+              <w:jc w:val="left"/>
+            </w:pPr>
+            <w:r>
+              <w:rPr>
+                <w:rFonts w:ascii="Calibri" w:hAnsi="Calibri" w:eastAsia="Calibri"/>
+                <w:b/>
+                <w:i w:val="0"/>
+                <w:color w:val="000000"/>
+                <w:sz w:val="24"/>
+              </w:rPr>
+              <w:t xml:space="preserve">Manpower Requisition Form </w:t>
+            </w:r>
+          </w:p>
+        </w:tc>
+        <w:tc>
+          <w:tcPr>
+            <w:tcW w:type="dxa" w:w="1700"/>
+            <w:tcBorders/>
+            <w:tcMar>
+              <w:start w:w="0" w:type="dxa"/>
+              <w:end w:w="0" w:type="dxa"/>
+            </w:tcMar>
+          </w:tcPr>
+          <w:p>
+            <w:pPr>
+              <w:autoSpaceDN w:val="0"/>
+              <w:autoSpaceDE w:val="0"/>
+              <w:widowControl/>
+              <w:spacing w:line="197" w:lineRule="auto" w:before="36" w:after="0"/>
+              <w:ind w:left="168" w:right="0" w:firstLine="0"/>
+              <w:jc w:val="left"/>
+            </w:pPr>
+            <w:r>
+              <w:rPr>
+                <w:rFonts w:ascii="Calibri" w:hAnsi="Calibri" w:eastAsia="Calibri"/>
+                <w:b/>
+                <w:i w:val="0"/>
+                <w:color w:val="000000"/>
+                <w:sz w:val="24"/>
+              </w:rPr>
+              <w:t xml:space="preserve">Issue No </w:t>
+            </w:r>
+          </w:p>
+        </w:tc>
+        <w:tc>
+          <w:tcPr>
+            <w:tcW w:type="dxa" w:w="2256"/>
+            <w:vMerge/>
+            <w:tcBorders/>
+          </w:tcPr>
+          <w:p/>
+        </w:tc>
+      </w:tr>
+      <w:tr>
+        <w:trPr>
+          <w:trHeight w:hRule="exact" w:val="426"/>
+        </w:trPr>
+        <w:tc>
+          <w:tcPr>
+            <w:tcW w:type="dxa" w:w="2256"/>
+            <w:vMerge/>
+            <w:tcBorders/>
+          </w:tcPr>
+          <w:p/>
+        </w:tc>
+        <w:tc>
+          <w:tcPr>
+            <w:tcW w:type="dxa" w:w="4060"/>
+            <w:tcBorders/>
+            <w:tcMar>
+              <w:start w:w="0" w:type="dxa"/>
+              <w:end w:w="0" w:type="dxa"/>
+            </w:tcMar>
+          </w:tcPr>
+          <w:p>
+            <w:pPr>
+              <w:autoSpaceDN w:val="0"/>
+              <w:autoSpaceDE w:val="0"/>
+              <w:widowControl/>
+              <w:spacing w:line="197" w:lineRule="auto" w:before="126" w:after="0"/>
+              <w:ind w:left="286" w:right="0" w:firstLine="0"/>
+              <w:jc w:val="left"/>
+            </w:pPr>
+            <w:r>
+              <w:rPr>
+                <w:rFonts w:ascii="Calibri" w:hAnsi="Calibri" w:eastAsia="Calibri"/>
+                <w:b/>
+                <w:i w:val="0"/>
+                <w:color w:val="000000"/>
+                <w:sz w:val="24"/>
+              </w:rPr>
+              <w:t xml:space="preserve">GSSG-HR 300-001 </w:t>
+            </w:r>
+          </w:p>
+        </w:tc>
+        <w:tc>
+          <w:tcPr>
+            <w:tcW w:type="dxa" w:w="1700"/>
+            <w:tcBorders/>
+            <w:tcMar>
+              <w:start w:w="0" w:type="dxa"/>
+              <w:end w:w="0" w:type="dxa"/>
+            </w:tcMar>
+          </w:tcPr>
+          <w:p>
+            <w:pPr>
+              <w:autoSpaceDN w:val="0"/>
+              <w:autoSpaceDE w:val="0"/>
+              <w:widowControl/>
+              <w:spacing w:line="197" w:lineRule="auto" w:before="126" w:after="0"/>
+              <w:ind w:left="168" w:right="0" w:firstLine="0"/>
+              <w:jc w:val="left"/>
+            </w:pPr>
+            <w:r>
+              <w:rPr>
+                <w:rFonts w:ascii="Calibri" w:hAnsi="Calibri" w:eastAsia="Calibri"/>
+                <w:b/>
+                <w:i w:val="0"/>
+                <w:color w:val="000000"/>
+                <w:sz w:val="24"/>
+              </w:rPr>
+              <w:t xml:space="preserve">Revision: </w:t>
+            </w:r>
+          </w:p>
+        </w:tc>
+        <w:tc>
+          <w:tcPr>
+            <w:tcW w:type="dxa" w:w="1820"/>
+            <w:tcBorders/>
+            <w:tcMar>
+              <w:start w:w="0" w:type="dxa"/>
+              <w:end w:w="0" w:type="dxa"/>
+            </w:tcMar>
+          </w:tcPr>
+          <w:p>
+            <w:pPr>
+              <w:autoSpaceDN w:val="0"/>
+              <w:autoSpaceDE w:val="0"/>
+              <w:widowControl/>
+              <w:spacing w:line="197" w:lineRule="auto" w:before="122" w:after="0"/>
+              <w:ind w:left="196" w:right="0" w:firstLine="0"/>
+              <w:jc w:val="left"/>
+            </w:pPr>
+            <w:r>
+              <w:rPr>
+                <w:rFonts w:ascii="Calibri" w:hAnsi="Calibri" w:eastAsia="Calibri"/>
+                <w:b w:val="0"/>
+                <w:i w:val="0"/>
+                <w:color w:val="000000"/>
+                <w:sz w:val="22"/>
+              </w:rPr>
+              <w:t xml:space="preserve">01 </w:t>
+            </w:r>
+          </w:p>
+        </w:tc>
+      </w:tr>
+    </w:tbl>
+    <w:p>
+      <w:pPr>
+        <w:autoSpaceDN w:val="0"/>
+        <w:autoSpaceDE w:val="0"/>
+        <w:widowControl/>
+        <w:spacing w:line="240" w:lineRule="auto" w:before="294" w:after="156"/>
+        <w:ind w:left="1420" w:right="0" w:firstLine="0"/>
+        <w:jc w:val="left"/>
+      </w:pPr>
+      <w:r>
+        <w:drawing>
+          <wp:inline xmlns:a="http://schemas.openxmlformats.org/drawingml/2006/main" xmlns:pic="http://schemas.openxmlformats.org/drawingml/2006/picture">
+            <wp:extent cx="6654800" cy="215900"/>
+            <wp:docPr id="2" name="Picture 2"/>
+            <wp:cNvGraphicFramePr>
+              <a:graphicFrameLocks noChangeAspect="1"/>
+            </wp:cNvGraphicFramePr>
+            <a:graphic>
+              <a:graphicData uri="http://schemas.openxmlformats.org/drawingml/2006/picture">
+                <pic:pic>
+                  <pic:nvPicPr>
+                    <pic:cNvPr id="0" name="image.png"/>
+                    <pic:cNvPicPr/>
+                  </pic:nvPicPr>
+                  <pic:blipFill>
+                    <a:blip r:embed="rId10"/>
+                    <a:stretch>
+                      <a:fillRect/>
+                    </a:stretch>
+                  </pic:blipFill>
+                  <pic:spPr>
+                    <a:xfrm>
+                      <a:off x="0" y="0"/>
+                      <a:ext cx="6654800" cy="215900"/>
+                    </a:xfrm>
+                    <a:prstGeom prst="rect"/>
+                  </pic:spPr>
+                </pic:pic>
+              </a:graphicData>
+            </a:graphic>
+          </wp:inline>
+        </w:drawing>
+      </w:r>
+    </w:p>
+    <w:tbl>
+      <w:tblPr>
+        <w:tblW w:type="auto" w:w="0"/>
+        <w:tblLayout w:type="fixed"/>
+        <w:tblLook w:firstColumn="1" w:firstRow="1" w:lastColumn="0" w:lastRow="0" w:noHBand="0" w:noVBand="1" w:val="04A0"/>
+        <w:tblInd w:w="816.0" w:type="dxa"/>
+      </w:tblPr>
+      <w:tblGrid>
+        <w:gridCol w:w="1289"/>
+        <w:gridCol w:w="1289"/>
+        <w:gridCol w:w="1289"/>
+        <w:gridCol w:w="1289"/>
+        <w:gridCol w:w="1289"/>
+        <w:gridCol w:w="1289"/>
+        <w:gridCol w:w="1289"/>
+      </w:tblGrid>
+      <w:tr>
+        <w:trPr>
+          <w:trHeight w:hRule="exact" w:val="412"/>
+        </w:trPr>
+        <w:tc>
+          <w:tcPr>
+            <w:tcW w:type="dxa" w:w="2910"/>
+            <w:tcBorders>
+              <w:start w:sz="3.1999999999999886" w:val="single" w:color="#000000"/>
+              <w:top w:sz="4.0" w:val="single" w:color="#000000"/>
+              <w:end w:sz="4.0" w:val="single" w:color="#000000"/>
+              <w:bottom w:sz="4.0" w:val="single" w:color="#000000"/>
+            </w:tcBorders>
+            <w:shd w:fill="f1f2f1"/>
+            <w:tcMar>
+              <w:start w:w="0" w:type="dxa"/>
+              <w:end w:w="0" w:type="dxa"/>
+            </w:tcMar>
+          </w:tcPr>
+          <w:p>
+            <w:pPr>
+              <w:autoSpaceDN w:val="0"/>
+              <w:autoSpaceDE w:val="0"/>
+              <w:widowControl/>
+              <w:spacing w:line="194" w:lineRule="auto" w:before="122" w:after="0"/>
+              <w:ind w:left="104" w:right="0" w:firstLine="0"/>
+              <w:jc w:val="left"/>
+            </w:pPr>
+            <w:r>
+              <w:rPr>
+                <w:rFonts w:ascii="Calibri" w:hAnsi="Calibri" w:eastAsia="Calibri"/>
+                <w:b/>
+                <w:i w:val="0"/>
+                <w:color w:val="000000"/>
+                <w:sz w:val="20"/>
+              </w:rPr>
+              <w:t xml:space="preserve">Job Title / Designation </w:t>
+            </w:r>
+          </w:p>
+        </w:tc>
+        <w:tc>
+          <w:tcPr>
+            <w:tcW w:type="dxa" w:w="7618"/>
+            <w:gridSpan w:val="6"/>
+            <w:tcBorders>
+              <w:start w:sz="4.0" w:val="single" w:color="#000000"/>
+              <w:top w:sz="4.0" w:val="single" w:color="#000000"/>
+              <w:end w:sz="4.0" w:val="single" w:color="#000000"/>
+              <w:bottom w:sz="4.0" w:val="single" w:color="#000000"/>
+            </w:tcBorders>
+            <w:tcMar>
+              <w:start w:w="0" w:type="dxa"/>
+              <w:end w:w="0" w:type="dxa"/>
+            </w:tcMar>
+            <w:tcMar>
+              <w:start w:w="0" w:type="dxa"/>
+              <w:end w:w="0" w:type="dxa"/>
+            </w:tcMar>
+            <w:tcMar>
+              <w:start w:w="0" w:type="dxa"/>
+              <w:end w:w="0" w:type="dxa"/>
+            </w:tcMar>
+            <w:tcMar>
+              <w:start w:w="0" w:type="dxa"/>
+              <w:end w:w="0" w:type="dxa"/>
+            </w:tcMar>
+            <w:tcMar>
+              <w:start w:w="0" w:type="dxa"/>
+              <w:end w:w="0" w:type="dxa"/>
+            </w:tcMar>
+            <w:tcMar>
+              <w:start w:w="0" w:type="dxa"/>
+              <w:end w:w="0" w:type="dxa"/>
+            </w:tcMar>
           </w:tcPr>
           <w:p>
             <w:r>
-              <w:rPr>
-                <w:sz w:val="20"/>
-              </w:rPr>
               <w:t>{{ job_title }}</w:t>
             </w:r>
           </w:p>
         </w:tc>
       </w:tr>
       <w:tr>
+        <w:trPr>
+          <w:trHeight w:hRule="exact" w:val="412"/>
+        </w:trPr>
         <w:tc>
           <w:tcPr>
-            <w:tcW w:type="dxa" w:w="4320"/>
+            <w:tcW w:type="dxa" w:w="2910"/>
+            <w:tcBorders>
+              <w:start w:sz="3.1999999999999886" w:val="single" w:color="#000000"/>
+              <w:top w:sz="4.0" w:val="single" w:color="#000000"/>
+              <w:end w:sz="4.0" w:val="single" w:color="#000000"/>
+              <w:bottom w:sz="4.0" w:val="single" w:color="#000000"/>
+            </w:tcBorders>
+            <w:shd w:fill="f1f2f1"/>
+            <w:tcMar>
+              <w:start w:w="0" w:type="dxa"/>
+              <w:end w:w="0" w:type="dxa"/>
+            </w:tcMar>
           </w:tcPr>
           <w:p>
+            <w:pPr>
+              <w:autoSpaceDN w:val="0"/>
+              <w:autoSpaceDE w:val="0"/>
+              <w:widowControl/>
+              <w:spacing w:line="197" w:lineRule="auto" w:before="122" w:after="0"/>
+              <w:ind w:left="104" w:right="0" w:firstLine="0"/>
+              <w:jc w:val="left"/>
+            </w:pPr>
             <w:r>
-              <w:t>Department / القسم</w:t>
+              <w:rPr>
+                <w:rFonts w:ascii="Calibri" w:hAnsi="Calibri" w:eastAsia="Calibri"/>
+                <w:b/>
+                <w:i w:val="0"/>
+                <w:color w:val="000000"/>
+                <w:sz w:val="20"/>
+              </w:rPr>
+              <w:t xml:space="preserve">Department </w:t>
             </w:r>
           </w:p>
         </w:tc>
         <w:tc>
           <w:tcPr>
-            <w:tcW w:type="dxa" w:w="4320"/>
+            <w:tcW w:type="dxa" w:w="7618"/>
+            <w:gridSpan w:val="6"/>
+            <w:tcBorders>
+              <w:start w:sz="4.0" w:val="single" w:color="#000000"/>
+              <w:top w:sz="4.0" w:val="single" w:color="#000000"/>
+              <w:end w:sz="4.0" w:val="single" w:color="#000000"/>
+              <w:bottom w:sz="4.0" w:val="single" w:color="#000000"/>
+            </w:tcBorders>
+            <w:tcMar>
+              <w:start w:w="0" w:type="dxa"/>
+              <w:end w:w="0" w:type="dxa"/>
+            </w:tcMar>
+            <w:tcMar>
+              <w:start w:w="0" w:type="dxa"/>
+              <w:end w:w="0" w:type="dxa"/>
+            </w:tcMar>
+            <w:tcMar>
+              <w:start w:w="0" w:type="dxa"/>
+              <w:end w:w="0" w:type="dxa"/>
+            </w:tcMar>
+            <w:tcMar>
+              <w:start w:w="0" w:type="dxa"/>
+              <w:end w:w="0" w:type="dxa"/>
+            </w:tcMar>
+            <w:tcMar>
+              <w:start w:w="0" w:type="dxa"/>
+              <w:end w:w="0" w:type="dxa"/>
+            </w:tcMar>
+            <w:tcMar>
+              <w:start w:w="0" w:type="dxa"/>
+              <w:end w:w="0" w:type="dxa"/>
+            </w:tcMar>
           </w:tcPr>
           <w:p>
             <w:r>
-              <w:rPr>
-                <w:sz w:val="20"/>
-              </w:rPr>
               <w:t>{{ req_department }}</w:t>
             </w:r>
           </w:p>
         </w:tc>
       </w:tr>
       <w:tr>
+        <w:trPr>
+          <w:trHeight w:hRule="exact" w:val="412"/>
+        </w:trPr>
         <w:tc>
           <w:tcPr>
-            <w:tcW w:type="dxa" w:w="4320"/>
+            <w:tcW w:type="dxa" w:w="2910"/>
+            <w:tcBorders>
+              <w:start w:sz="3.1999999999999886" w:val="single" w:color="#000000"/>
+              <w:top w:sz="4.0" w:val="single" w:color="#000000"/>
+              <w:end w:sz="4.0" w:val="single" w:color="#000000"/>
+              <w:bottom w:sz="4.0" w:val="single" w:color="#000000"/>
+            </w:tcBorders>
+            <w:shd w:fill="f1f2f1"/>
+            <w:tcMar>
+              <w:start w:w="0" w:type="dxa"/>
+              <w:end w:w="0" w:type="dxa"/>
+            </w:tcMar>
           </w:tcPr>
           <w:p>
+            <w:pPr>
+              <w:autoSpaceDN w:val="0"/>
+              <w:autoSpaceDE w:val="0"/>
+              <w:widowControl/>
+              <w:spacing w:line="197" w:lineRule="auto" w:before="122" w:after="0"/>
+              <w:ind w:left="104" w:right="0" w:firstLine="0"/>
+              <w:jc w:val="left"/>
+            </w:pPr>
             <w:r>
-              <w:t>Location / الموقع</w:t>
+              <w:rPr>
+                <w:rFonts w:ascii="Calibri" w:hAnsi="Calibri" w:eastAsia="Calibri"/>
+                <w:b/>
+                <w:i w:val="0"/>
+                <w:color w:val="000000"/>
+                <w:sz w:val="20"/>
+              </w:rPr>
+              <w:t xml:space="preserve">Location </w:t>
             </w:r>
           </w:p>
         </w:tc>
         <w:tc>
           <w:tcPr>
-            <w:tcW w:type="dxa" w:w="4320"/>
+            <w:tcW w:type="dxa" w:w="7618"/>
+            <w:gridSpan w:val="6"/>
+            <w:tcBorders>
+              <w:start w:sz="4.0" w:val="single" w:color="#000000"/>
+              <w:top w:sz="4.0" w:val="single" w:color="#000000"/>
+              <w:end w:sz="4.0" w:val="single" w:color="#000000"/>
+              <w:bottom w:sz="4.0" w:val="single" w:color="#000000"/>
+            </w:tcBorders>
+            <w:tcMar>
+              <w:start w:w="0" w:type="dxa"/>
+              <w:end w:w="0" w:type="dxa"/>
+            </w:tcMar>
+            <w:tcMar>
+              <w:start w:w="0" w:type="dxa"/>
+              <w:end w:w="0" w:type="dxa"/>
+            </w:tcMar>
+            <w:tcMar>
+              <w:start w:w="0" w:type="dxa"/>
+              <w:end w:w="0" w:type="dxa"/>
+            </w:tcMar>
+            <w:tcMar>
+              <w:start w:w="0" w:type="dxa"/>
+              <w:end w:w="0" w:type="dxa"/>
+            </w:tcMar>
+            <w:tcMar>
+              <w:start w:w="0" w:type="dxa"/>
+              <w:end w:w="0" w:type="dxa"/>
+            </w:tcMar>
+            <w:tcMar>
+              <w:start w:w="0" w:type="dxa"/>
+              <w:end w:w="0" w:type="dxa"/>
+            </w:tcMar>
           </w:tcPr>
           <w:p>
             <w:r>
-              <w:rPr>
-                <w:sz w:val="20"/>
-              </w:rPr>
               <w:t>{{ req_location }}</w:t>
             </w:r>
           </w:p>
         </w:tc>
       </w:tr>
       <w:tr>
+        <w:trPr>
+          <w:trHeight w:hRule="exact" w:val="414"/>
+        </w:trPr>
         <w:tc>
           <w:tcPr>
-            <w:tcW w:type="dxa" w:w="4320"/>
+            <w:tcW w:type="dxa" w:w="2910"/>
+            <w:vMerge w:val="restart"/>
+            <w:tcBorders>
+              <w:start w:sz="3.1999999999999886" w:val="single" w:color="#000000"/>
+              <w:top w:sz="4.0" w:val="single" w:color="#000000"/>
+              <w:end w:sz="4.0" w:val="single" w:color="#000000"/>
+              <w:bottom w:sz="4.0" w:val="single" w:color="#000000"/>
+            </w:tcBorders>
+            <w:shd w:fill="f1f2f1"/>
+            <w:tcMar>
+              <w:start w:w="0" w:type="dxa"/>
+              <w:end w:w="0" w:type="dxa"/>
+            </w:tcMar>
+            <w:tcMar>
+              <w:start w:w="0" w:type="dxa"/>
+              <w:end w:w="0" w:type="dxa"/>
+            </w:tcMar>
+            <w:tcMar>
+              <w:start w:w="0" w:type="dxa"/>
+              <w:end w:w="0" w:type="dxa"/>
+            </w:tcMar>
           </w:tcPr>
           <w:p>
+            <w:pPr>
+              <w:autoSpaceDN w:val="0"/>
+              <w:autoSpaceDE w:val="0"/>
+              <w:widowControl/>
+              <w:spacing w:line="197" w:lineRule="auto" w:before="534" w:after="0"/>
+              <w:ind w:left="104" w:right="0" w:firstLine="0"/>
+              <w:jc w:val="left"/>
+            </w:pPr>
             <w:r>
-              <w:t>Nature of Vacancy / طبيعة الشاغر</w:t>
+              <w:rPr>
+                <w:rFonts w:ascii="Calibri" w:hAnsi="Calibri" w:eastAsia="Calibri"/>
+                <w:b/>
+                <w:i w:val="0"/>
+                <w:color w:val="000000"/>
+                <w:sz w:val="20"/>
+              </w:rPr>
+              <w:t xml:space="preserve">Nature of Vacancy </w:t>
             </w:r>
           </w:p>
         </w:tc>
         <w:tc>
           <w:tcPr>
-            <w:tcW w:type="dxa" w:w="4320"/>
+            <w:tcW w:type="dxa" w:w="468"/>
+            <w:tcBorders>
+              <w:start w:sz="4.0" w:val="single" w:color="#000000"/>
+              <w:top w:sz="4.0" w:val="single" w:color="#000000"/>
+              <w:end w:sz="4.0" w:val="single" w:color="#000000"/>
+              <w:bottom w:sz="3.199999999999818" w:val="single" w:color="#000000"/>
+            </w:tcBorders>
+            <w:tcMar>
+              <w:start w:w="0" w:type="dxa"/>
+              <w:end w:w="0" w:type="dxa"/>
+            </w:tcMar>
           </w:tcPr>
           <w:p>
+            <w:pPr>
+              <w:autoSpaceDN w:val="0"/>
+              <w:autoSpaceDE w:val="0"/>
+              <w:widowControl/>
+              <w:spacing w:line="238" w:lineRule="auto" w:before="96" w:after="0"/>
+              <w:ind w:left="0" w:right="0" w:firstLine="0"/>
+              <w:jc w:val="center"/>
+            </w:pPr>
             <w:r>
               <w:rPr>
+                <w:rFonts w:ascii="Arial" w:hAnsi="Arial" w:eastAsia="Wingdings 2"/>
+                <w:b w:val="0"/>
+                <w:i w:val="0"/>
+                <w:color w:val="000000"/>
                 <w:sz w:val="20"/>
               </w:rPr>
-              <w:t>{{ vacancy_nature }}</w:t>
-            </w:r>
-          </w:p>
-        </w:tc>
-      </w:tr>
-      <w:tr>
-        <w:tc>
-          <w:tcPr>
-            <w:tcW w:type="dxa" w:w="4320"/>
-          </w:tcPr>
-          <w:p>
-            <w:r>
-              <w:t>Number of Employees Required / عدد الموظفين المطلوب</w:t>
+              <w:t>{{ '☑' if vacancy_nature == 'Permanent' else '☐' }}</w:t>
             </w:r>
           </w:p>
         </w:tc>
         <w:tc>
           <w:tcPr>
-            <w:tcW w:type="dxa" w:w="4320"/>
+            <w:tcW w:type="dxa" w:w="1528"/>
+            <w:tcBorders>
+              <w:start w:sz="4.0" w:val="single" w:color="#000000"/>
+              <w:top w:sz="4.0" w:val="single" w:color="#000000"/>
+              <w:end w:sz="4.0" w:val="single" w:color="#000000"/>
+              <w:bottom w:sz="3.199999999999818" w:val="single" w:color="#000000"/>
+            </w:tcBorders>
+            <w:tcMar>
+              <w:start w:w="0" w:type="dxa"/>
+              <w:end w:w="0" w:type="dxa"/>
+            </w:tcMar>
           </w:tcPr>
           <w:p>
+            <w:pPr>
+              <w:autoSpaceDN w:val="0"/>
+              <w:autoSpaceDE w:val="0"/>
+              <w:widowControl/>
+              <w:spacing w:line="194" w:lineRule="auto" w:before="122" w:after="0"/>
+              <w:ind w:left="104" w:right="0" w:firstLine="0"/>
+              <w:jc w:val="left"/>
+            </w:pPr>
             <w:r>
               <w:rPr>
+                <w:rFonts w:ascii="Calibri" w:hAnsi="Calibri" w:eastAsia="Calibri"/>
+                <w:b w:val="0"/>
+                <w:i w:val="0"/>
+                <w:color w:val="000000"/>
                 <w:sz w:val="20"/>
               </w:rPr>
+              <w:t xml:space="preserve">Permanent </w:t>
+            </w:r>
+          </w:p>
+        </w:tc>
+        <w:tc>
+          <w:tcPr>
+            <w:tcW w:type="dxa" w:w="474"/>
+            <w:tcBorders>
+              <w:start w:sz="4.0" w:val="single" w:color="#000000"/>
+              <w:top w:sz="4.0" w:val="single" w:color="#000000"/>
+              <w:end w:sz="4.0" w:val="single" w:color="#000000"/>
+              <w:bottom w:sz="3.199999999999818" w:val="single" w:color="#000000"/>
+            </w:tcBorders>
+            <w:tcMar>
+              <w:start w:w="0" w:type="dxa"/>
+              <w:end w:w="0" w:type="dxa"/>
+            </w:tcMar>
+          </w:tcPr>
+          <w:p>
+            <w:pPr>
+              <w:autoSpaceDN w:val="0"/>
+              <w:autoSpaceDE w:val="0"/>
+              <w:widowControl/>
+              <w:spacing w:line="238" w:lineRule="auto" w:before="96" w:after="0"/>
+              <w:ind w:left="102" w:right="0" w:firstLine="0"/>
+              <w:jc w:val="left"/>
+            </w:pPr>
+            <w:r>
+              <w:rPr>
+                <w:rFonts w:ascii="Arial" w:hAnsi="Arial" w:eastAsia="Wingdings 2"/>
+                <w:b w:val="0"/>
+                <w:i w:val="0"/>
+                <w:color w:val="000000"/>
+                <w:sz w:val="20"/>
+              </w:rPr>
+              <w:t>{{ '☑' if vacancy_nature == 'Contract' else '☐' }}</w:t>
+            </w:r>
+          </w:p>
+        </w:tc>
+        <w:tc>
+          <w:tcPr>
+            <w:tcW w:type="dxa" w:w="1800"/>
+            <w:tcBorders>
+              <w:start w:sz="4.0" w:val="single" w:color="#000000"/>
+              <w:top w:sz="4.0" w:val="single" w:color="#000000"/>
+              <w:end w:sz="3.199999999999818" w:val="single" w:color="#000000"/>
+              <w:bottom w:sz="3.199999999999818" w:val="single" w:color="#000000"/>
+            </w:tcBorders>
+            <w:tcMar>
+              <w:start w:w="0" w:type="dxa"/>
+              <w:end w:w="0" w:type="dxa"/>
+            </w:tcMar>
+          </w:tcPr>
+          <w:p>
+            <w:pPr>
+              <w:autoSpaceDN w:val="0"/>
+              <w:autoSpaceDE w:val="0"/>
+              <w:widowControl/>
+              <w:spacing w:line="194" w:lineRule="auto" w:before="122" w:after="0"/>
+              <w:ind w:left="102" w:right="0" w:firstLine="0"/>
+              <w:jc w:val="left"/>
+            </w:pPr>
+            <w:r>
+              <w:rPr>
+                <w:rFonts w:ascii="Calibri" w:hAnsi="Calibri" w:eastAsia="Calibri"/>
+                <w:b w:val="0"/>
+                <w:i w:val="0"/>
+                <w:color w:val="000000"/>
+                <w:sz w:val="20"/>
+              </w:rPr>
+              <w:t xml:space="preserve">Contract </w:t>
+            </w:r>
+          </w:p>
+        </w:tc>
+        <w:tc>
+          <w:tcPr>
+            <w:tcW w:type="dxa" w:w="472"/>
+            <w:tcBorders>
+              <w:start w:sz="3.199999999999818" w:val="single" w:color="#000000"/>
+              <w:top w:sz="4.0" w:val="single" w:color="#000000"/>
+              <w:end w:sz="4.0" w:val="single" w:color="#000000"/>
+              <w:bottom w:sz="3.199999999999818" w:val="single" w:color="#000000"/>
+            </w:tcBorders>
+            <w:tcMar>
+              <w:start w:w="0" w:type="dxa"/>
+              <w:end w:w="0" w:type="dxa"/>
+            </w:tcMar>
+          </w:tcPr>
+          <w:p>
+            <w:pPr>
+              <w:autoSpaceDN w:val="0"/>
+              <w:autoSpaceDE w:val="0"/>
+              <w:widowControl/>
+              <w:spacing w:line="238" w:lineRule="auto" w:before="96" w:after="0"/>
+              <w:ind w:left="0" w:right="0" w:firstLine="0"/>
+              <w:jc w:val="center"/>
+            </w:pPr>
+            <w:r>
+              <w:rPr>
+                <w:rFonts w:ascii="Wingdings 2" w:hAnsi="Wingdings 2" w:eastAsia="Wingdings 2"/>
+                <w:b w:val="0"/>
+                <w:i w:val="0"/>
+                <w:color w:val="000000"/>
+                <w:sz w:val="20"/>
+              </w:rPr>
+              <w:t></w:t>
+            </w:r>
+            <w:r/>
+          </w:p>
+        </w:tc>
+        <w:tc>
+          <w:tcPr>
+            <w:tcW w:type="dxa" w:w="2876"/>
+            <w:tcBorders>
+              <w:start w:sz="4.0" w:val="single" w:color="#000000"/>
+              <w:top w:sz="4.0" w:val="single" w:color="#000000"/>
+              <w:end w:sz="4.0" w:val="single" w:color="#000000"/>
+              <w:bottom w:sz="3.199999999999818" w:val="single" w:color="#000000"/>
+            </w:tcBorders>
+            <w:tcMar>
+              <w:start w:w="0" w:type="dxa"/>
+              <w:end w:w="0" w:type="dxa"/>
+            </w:tcMar>
+          </w:tcPr>
+          <w:p>
+            <w:pPr>
+              <w:autoSpaceDN w:val="0"/>
+              <w:autoSpaceDE w:val="0"/>
+              <w:widowControl/>
+              <w:spacing w:line="194" w:lineRule="auto" w:before="122" w:after="0"/>
+              <w:ind w:left="0" w:right="0" w:firstLine="0"/>
+              <w:jc w:val="center"/>
+            </w:pPr>
+            <w:r>
+              <w:rPr>
+                <w:rFonts w:ascii="Calibri" w:hAnsi="Calibri" w:eastAsia="Calibri"/>
+                <w:b w:val="0"/>
+                <w:i w:val="0"/>
+                <w:color w:val="000000"/>
+                <w:sz w:val="20"/>
+              </w:rPr>
+              <w:t xml:space="preserve">Number of Employees Required </w:t>
+            </w:r>
+            <w:r>
+              <w:t xml:space="preserve"> </w:t>
+            </w:r>
+            <w:r/>
+          </w:p>
+          <w:p>
+            <w:r>
               <w:t>{{ positions_required }}</w:t>
             </w:r>
           </w:p>
         </w:tc>
       </w:tr>
       <w:tr>
+        <w:trPr>
+          <w:trHeight w:hRule="exact" w:val="414"/>
+        </w:trPr>
         <w:tc>
           <w:tcPr>
-            <w:tcW w:type="dxa" w:w="4320"/>
+            <w:tcW w:type="dxa" w:w="1289"/>
+            <w:vMerge/>
+            <w:tcBorders>
+              <w:start w:sz="3.1999999999999886" w:val="single" w:color="#000000"/>
+              <w:top w:sz="4.0" w:val="single" w:color="#000000"/>
+              <w:end w:sz="4.0" w:val="single" w:color="#000000"/>
+              <w:bottom w:sz="4.0" w:val="single" w:color="#000000"/>
+            </w:tcBorders>
+          </w:tcPr>
+          <w:p/>
+        </w:tc>
+        <w:tc>
+          <w:tcPr>
+            <w:tcW w:type="dxa" w:w="468"/>
+            <w:tcBorders>
+              <w:start w:sz="4.0" w:val="single" w:color="#000000"/>
+              <w:top w:sz="3.199999999999818" w:val="single" w:color="#000000"/>
+              <w:end w:sz="4.0" w:val="single" w:color="#000000"/>
+              <w:bottom w:sz="4.0" w:val="single" w:color="#000000"/>
+            </w:tcBorders>
+            <w:tcMar>
+              <w:start w:w="0" w:type="dxa"/>
+              <w:end w:w="0" w:type="dxa"/>
+            </w:tcMar>
           </w:tcPr>
           <w:p>
+            <w:pPr>
+              <w:autoSpaceDN w:val="0"/>
+              <w:autoSpaceDE w:val="0"/>
+              <w:widowControl/>
+              <w:spacing w:line="240" w:lineRule="auto" w:before="96" w:after="0"/>
+              <w:ind w:left="0" w:right="0" w:firstLine="0"/>
+              <w:jc w:val="center"/>
+            </w:pPr>
             <w:r>
-              <w:t>New Hire or Replacement / توظيف جديد أم إحلال</w:t>
+              <w:rPr>
+                <w:rFonts w:ascii="Arial" w:hAnsi="Arial" w:eastAsia="Wingdings 2"/>
+                <w:b w:val="0"/>
+                <w:i w:val="0"/>
+                <w:color w:val="000000"/>
+                <w:sz w:val="20"/>
+              </w:rPr>
+              <w:t>{{ '☑' if hiring_reason == 'New Hire' else '☐' }}</w:t>
             </w:r>
           </w:p>
         </w:tc>
         <w:tc>
           <w:tcPr>
-            <w:tcW w:type="dxa" w:w="4320"/>
+            <w:tcW w:type="dxa" w:w="1528"/>
+            <w:tcBorders>
+              <w:start w:sz="4.0" w:val="single" w:color="#000000"/>
+              <w:top w:sz="3.199999999999818" w:val="single" w:color="#000000"/>
+              <w:end w:sz="4.0" w:val="single" w:color="#000000"/>
+              <w:bottom w:sz="4.0" w:val="single" w:color="#000000"/>
+            </w:tcBorders>
+            <w:tcMar>
+              <w:start w:w="0" w:type="dxa"/>
+              <w:end w:w="0" w:type="dxa"/>
+            </w:tcMar>
           </w:tcPr>
           <w:p>
+            <w:pPr>
+              <w:autoSpaceDN w:val="0"/>
+              <w:autoSpaceDE w:val="0"/>
+              <w:widowControl/>
+              <w:spacing w:line="197" w:lineRule="auto" w:before="122" w:after="0"/>
+              <w:ind w:left="104" w:right="0" w:firstLine="0"/>
+              <w:jc w:val="left"/>
+            </w:pPr>
             <w:r>
               <w:rPr>
+                <w:rFonts w:ascii="Calibri" w:hAnsi="Calibri" w:eastAsia="Calibri"/>
+                <w:b w:val="0"/>
+                <w:i w:val="0"/>
+                <w:color w:val="000000"/>
                 <w:sz w:val="20"/>
               </w:rPr>
-              <w:t>{{ hiring_reason }}</w:t>
+              <w:t xml:space="preserve">New Hire </w:t>
+            </w:r>
+            <w:r/>
+          </w:p>
+        </w:tc>
+        <w:tc>
+          <w:tcPr>
+            <w:tcW w:type="dxa" w:w="5622"/>
+            <w:gridSpan w:val="4"/>
+            <w:tcBorders>
+              <w:start w:sz="4.0" w:val="single" w:color="#000000"/>
+              <w:top w:sz="3.199999999999818" w:val="single" w:color="#000000"/>
+              <w:end w:sz="4.0" w:val="single" w:color="#000000"/>
+              <w:bottom w:sz="4.0" w:val="single" w:color="#000000"/>
+            </w:tcBorders>
+            <w:tcMar>
+              <w:start w:w="0" w:type="dxa"/>
+              <w:end w:w="0" w:type="dxa"/>
+            </w:tcMar>
+            <w:tcMar>
+              <w:start w:w="0" w:type="dxa"/>
+              <w:end w:w="0" w:type="dxa"/>
+            </w:tcMar>
+            <w:tcMar>
+              <w:start w:w="0" w:type="dxa"/>
+              <w:end w:w="0" w:type="dxa"/>
+            </w:tcMar>
+            <w:tcMar>
+              <w:start w:w="0" w:type="dxa"/>
+              <w:end w:w="0" w:type="dxa"/>
+            </w:tcMar>
+          </w:tcPr>
+          <w:p>
+            <w:pPr>
+              <w:autoSpaceDN w:val="0"/>
+              <w:tabs>
+                <w:tab w:pos="1478" w:val="left"/>
+              </w:tabs>
+              <w:autoSpaceDE w:val="0"/>
+              <w:widowControl/>
+              <w:spacing w:line="216" w:lineRule="auto" w:before="104" w:after="0"/>
+              <w:ind w:left="102" w:right="0" w:firstLine="0"/>
+              <w:jc w:val="left"/>
+            </w:pPr>
+            <w:r>
+              <w:rPr>
+                <w:rFonts w:ascii="Calibri" w:hAnsi="Calibri" w:eastAsia="Calibri"/>
+                <w:b w:val="0"/>
+                <w:i/>
+                <w:color w:val="000000"/>
+                <w:sz w:val="20"/>
+              </w:rPr>
+              <w:t xml:space="preserve">* Approved </w:t>
+            </w:r>
+            <w:r>
+              <w:tab/>
+            </w:r>
+            <w:r>
+              <w:rPr>
+                <w:rFonts w:ascii="Wingdings 2" w:hAnsi="Wingdings 2" w:eastAsia="Wingdings 2"/>
+                <w:b w:val="0"/>
+                <w:i w:val="0"/>
+                <w:color w:val="000000"/>
+                <w:sz w:val="20"/>
+              </w:rPr>
+              <w:t></w:t>
+            </w:r>
+            <w:r>
+              <w:rPr>
+                <w:rFonts w:ascii="Calibri" w:hAnsi="Calibri" w:eastAsia="Calibri"/>
+                <w:b w:val="0"/>
+                <w:i w:val="0"/>
+                <w:color w:val="000000"/>
+                <w:sz w:val="20"/>
+              </w:rPr>
+              <w:t xml:space="preserve">Yes </w:t>
+            </w:r>
+            <w:r>
+              <w:rPr>
+                <w:rFonts w:ascii="Wingdings 2" w:hAnsi="Wingdings 2" w:eastAsia="Wingdings 2"/>
+                <w:b w:val="0"/>
+                <w:i w:val="0"/>
+                <w:color w:val="000000"/>
+                <w:sz w:val="20"/>
+              </w:rPr>
+              <w:t></w:t>
+            </w:r>
+            <w:r>
+              <w:rPr>
+                <w:rFonts w:ascii="Calibri" w:hAnsi="Calibri" w:eastAsia="Calibri"/>
+                <w:b w:val="0"/>
+                <w:i w:val="0"/>
+                <w:color w:val="000000"/>
+                <w:sz w:val="20"/>
+              </w:rPr>
+              <w:t xml:space="preserve">No </w:t>
             </w:r>
           </w:p>
         </w:tc>
       </w:tr>
       <w:tr>
+        <w:trPr>
+          <w:trHeight w:hRule="exact" w:val="412"/>
+        </w:trPr>
         <w:tc>
           <w:tcPr>
-            <w:tcW w:type="dxa" w:w="4320"/>
+            <w:tcW w:type="dxa" w:w="1289"/>
+            <w:vMerge/>
+            <w:tcBorders>
+              <w:start w:sz="3.1999999999999886" w:val="single" w:color="#000000"/>
+              <w:top w:sz="4.0" w:val="single" w:color="#000000"/>
+              <w:end w:sz="4.0" w:val="single" w:color="#000000"/>
+              <w:bottom w:sz="4.0" w:val="single" w:color="#000000"/>
+            </w:tcBorders>
+          </w:tcPr>
+          <w:p/>
+        </w:tc>
+        <w:tc>
+          <w:tcPr>
+            <w:tcW w:type="dxa" w:w="468"/>
+            <w:tcBorders>
+              <w:start w:sz="4.0" w:val="single" w:color="#000000"/>
+              <w:top w:sz="4.0" w:val="single" w:color="#000000"/>
+              <w:end w:sz="4.0" w:val="single" w:color="#000000"/>
+              <w:bottom w:sz="4.0" w:val="single" w:color="#000000"/>
+            </w:tcBorders>
+            <w:tcMar>
+              <w:start w:w="0" w:type="dxa"/>
+              <w:end w:w="0" w:type="dxa"/>
+            </w:tcMar>
           </w:tcPr>
           <w:p>
+            <w:pPr>
+              <w:autoSpaceDN w:val="0"/>
+              <w:autoSpaceDE w:val="0"/>
+              <w:widowControl/>
+              <w:spacing w:line="238" w:lineRule="auto" w:before="96" w:after="0"/>
+              <w:ind w:left="0" w:right="0" w:firstLine="0"/>
+              <w:jc w:val="center"/>
+            </w:pPr>
             <w:r>
-              <w:t>Name of Vacating Employee / اسم الموظف المغادر</w:t>
+              <w:rPr>
+                <w:rFonts w:ascii="Arial" w:hAnsi="Arial" w:eastAsia="Wingdings 2"/>
+                <w:b w:val="0"/>
+                <w:i w:val="0"/>
+                <w:color w:val="000000"/>
+                <w:sz w:val="20"/>
+              </w:rPr>
+              <w:t>{{ '☑' if hiring_reason == 'Replacement' else '☐' }}</w:t>
             </w:r>
           </w:p>
         </w:tc>
         <w:tc>
           <w:tcPr>
-            <w:tcW w:type="dxa" w:w="4320"/>
+            <w:tcW w:type="dxa" w:w="1528"/>
+            <w:tcBorders>
+              <w:start w:sz="4.0" w:val="single" w:color="#000000"/>
+              <w:top w:sz="4.0" w:val="single" w:color="#000000"/>
+              <w:end w:sz="4.0" w:val="single" w:color="#000000"/>
+              <w:bottom w:sz="4.0" w:val="single" w:color="#000000"/>
+            </w:tcBorders>
+            <w:tcMar>
+              <w:start w:w="0" w:type="dxa"/>
+              <w:end w:w="0" w:type="dxa"/>
+            </w:tcMar>
+          </w:tcPr>
+          <w:p>
+            <w:pPr>
+              <w:autoSpaceDN w:val="0"/>
+              <w:autoSpaceDE w:val="0"/>
+              <w:widowControl/>
+              <w:spacing w:line="194" w:lineRule="auto" w:before="122" w:after="0"/>
+              <w:ind w:left="104" w:right="0" w:firstLine="0"/>
+              <w:jc w:val="left"/>
+            </w:pPr>
+            <w:r>
+              <w:rPr>
+                <w:rFonts w:ascii="Calibri" w:hAnsi="Calibri" w:eastAsia="Calibri"/>
+                <w:b w:val="0"/>
+                <w:i w:val="0"/>
+                <w:color w:val="000000"/>
+                <w:sz w:val="20"/>
+              </w:rPr>
+              <w:t xml:space="preserve">Replacement </w:t>
+            </w:r>
+          </w:p>
+        </w:tc>
+        <w:tc>
+          <w:tcPr>
+            <w:tcW w:type="dxa" w:w="5622"/>
+            <w:gridSpan w:val="4"/>
+            <w:tcBorders>
+              <w:start w:sz="4.0" w:val="single" w:color="#000000"/>
+              <w:top w:sz="4.0" w:val="single" w:color="#000000"/>
+              <w:end w:sz="4.0" w:val="single" w:color="#000000"/>
+              <w:bottom w:sz="4.0" w:val="single" w:color="#000000"/>
+            </w:tcBorders>
+            <w:tcMar>
+              <w:start w:w="0" w:type="dxa"/>
+              <w:end w:w="0" w:type="dxa"/>
+            </w:tcMar>
+            <w:tcMar>
+              <w:start w:w="0" w:type="dxa"/>
+              <w:end w:w="0" w:type="dxa"/>
+            </w:tcMar>
+            <w:tcMar>
+              <w:start w:w="0" w:type="dxa"/>
+              <w:end w:w="0" w:type="dxa"/>
+            </w:tcMar>
+            <w:tcMar>
+              <w:start w:w="0" w:type="dxa"/>
+              <w:end w:w="0" w:type="dxa"/>
+            </w:tcMar>
+          </w:tcPr>
+          <w:p/>
+        </w:tc>
+      </w:tr>
+      <w:tr>
+        <w:trPr>
+          <w:trHeight w:hRule="exact" w:val="412"/>
+        </w:trPr>
+        <w:tc>
+          <w:tcPr>
+            <w:tcW w:type="dxa" w:w="10528"/>
+            <w:gridSpan w:val="7"/>
+            <w:tcBorders>
+              <w:start w:sz="3.1999999999999886" w:val="single" w:color="#000000"/>
+              <w:top w:sz="4.0" w:val="single" w:color="#000000"/>
+              <w:end w:sz="4.0" w:val="single" w:color="#000000"/>
+              <w:bottom w:sz="4.0" w:val="single" w:color="#000000"/>
+            </w:tcBorders>
+            <w:shd w:fill="c00000"/>
+            <w:tcMar>
+              <w:start w:w="0" w:type="dxa"/>
+              <w:end w:w="0" w:type="dxa"/>
+            </w:tcMar>
+            <w:tcMar>
+              <w:start w:w="0" w:type="dxa"/>
+              <w:end w:w="0" w:type="dxa"/>
+            </w:tcMar>
+            <w:tcMar>
+              <w:start w:w="0" w:type="dxa"/>
+              <w:end w:w="0" w:type="dxa"/>
+            </w:tcMar>
+            <w:tcMar>
+              <w:start w:w="0" w:type="dxa"/>
+              <w:end w:w="0" w:type="dxa"/>
+            </w:tcMar>
+            <w:tcMar>
+              <w:start w:w="0" w:type="dxa"/>
+              <w:end w:w="0" w:type="dxa"/>
+            </w:tcMar>
+            <w:tcMar>
+              <w:start w:w="0" w:type="dxa"/>
+              <w:end w:w="0" w:type="dxa"/>
+            </w:tcMar>
+            <w:tcMar>
+              <w:start w:w="0" w:type="dxa"/>
+              <w:end w:w="0" w:type="dxa"/>
+            </w:tcMar>
+          </w:tcPr>
+          <w:p>
+            <w:pPr>
+              <w:autoSpaceDN w:val="0"/>
+              <w:autoSpaceDE w:val="0"/>
+              <w:widowControl/>
+              <w:spacing w:line="230" w:lineRule="auto" w:before="78" w:after="0"/>
+              <w:ind w:left="0" w:right="0" w:firstLine="0"/>
+              <w:jc w:val="center"/>
+            </w:pPr>
+            <w:r>
+              <w:rPr>
+                <w:rFonts w:ascii="Univers" w:hAnsi="Univers" w:eastAsia="Univers"/>
+                <w:b/>
+                <w:i w:val="0"/>
+                <w:color w:val="FFFFFF"/>
+                <w:sz w:val="20"/>
+              </w:rPr>
+              <w:t xml:space="preserve">If Replacement </w:t>
+            </w:r>
+          </w:p>
+        </w:tc>
+      </w:tr>
+      <w:tr>
+        <w:trPr>
+          <w:trHeight w:hRule="exact" w:val="416"/>
+        </w:trPr>
+        <w:tc>
+          <w:tcPr>
+            <w:tcW w:type="dxa" w:w="2910"/>
+            <w:tcBorders>
+              <w:start w:sz="3.1999999999999886" w:val="single" w:color="#000000"/>
+              <w:top w:sz="4.0" w:val="single" w:color="#000000"/>
+              <w:end w:sz="4.0" w:val="single" w:color="#000000"/>
+              <w:bottom w:sz="3.199999999999818" w:val="single" w:color="#000000"/>
+            </w:tcBorders>
+            <w:shd w:fill="f1f2f1"/>
+            <w:tcMar>
+              <w:start w:w="0" w:type="dxa"/>
+              <w:end w:w="0" w:type="dxa"/>
+            </w:tcMar>
+          </w:tcPr>
+          <w:p>
+            <w:pPr>
+              <w:autoSpaceDN w:val="0"/>
+              <w:autoSpaceDE w:val="0"/>
+              <w:widowControl/>
+              <w:spacing w:line="194" w:lineRule="auto" w:before="124" w:after="0"/>
+              <w:ind w:left="104" w:right="0" w:firstLine="0"/>
+              <w:jc w:val="left"/>
+            </w:pPr>
+            <w:r>
+              <w:rPr>
+                <w:rFonts w:ascii="Calibri" w:hAnsi="Calibri" w:eastAsia="Calibri"/>
+                <w:b/>
+                <w:i w:val="0"/>
+                <w:color w:val="000000"/>
+                <w:sz w:val="20"/>
+              </w:rPr>
+              <w:t xml:space="preserve">Name of Vacating Employee </w:t>
+            </w:r>
+          </w:p>
+        </w:tc>
+        <w:tc>
+          <w:tcPr>
+            <w:tcW w:type="dxa" w:w="7618"/>
+            <w:gridSpan w:val="6"/>
+            <w:tcBorders>
+              <w:start w:sz="4.0" w:val="single" w:color="#000000"/>
+              <w:top w:sz="4.0" w:val="single" w:color="#000000"/>
+              <w:end w:sz="4.0" w:val="single" w:color="#000000"/>
+              <w:bottom w:sz="3.199999999999818" w:val="single" w:color="#000000"/>
+            </w:tcBorders>
+            <w:tcMar>
+              <w:start w:w="0" w:type="dxa"/>
+              <w:end w:w="0" w:type="dxa"/>
+            </w:tcMar>
+            <w:tcMar>
+              <w:start w:w="0" w:type="dxa"/>
+              <w:end w:w="0" w:type="dxa"/>
+            </w:tcMar>
+            <w:tcMar>
+              <w:start w:w="0" w:type="dxa"/>
+              <w:end w:w="0" w:type="dxa"/>
+            </w:tcMar>
+            <w:tcMar>
+              <w:start w:w="0" w:type="dxa"/>
+              <w:end w:w="0" w:type="dxa"/>
+            </w:tcMar>
+            <w:tcMar>
+              <w:start w:w="0" w:type="dxa"/>
+              <w:end w:w="0" w:type="dxa"/>
+            </w:tcMar>
+            <w:tcMar>
+              <w:start w:w="0" w:type="dxa"/>
+              <w:end w:w="0" w:type="dxa"/>
+            </w:tcMar>
           </w:tcPr>
           <w:p>
             <w:r>
-              <w:rPr>
-                <w:sz w:val="20"/>
-              </w:rPr>
               <w:t>{{ vacating_employee_name }}</w:t>
             </w:r>
           </w:p>
         </w:tc>
       </w:tr>
       <w:tr>
+        <w:trPr>
+          <w:trHeight w:hRule="exact" w:val="414"/>
+        </w:trPr>
         <w:tc>
           <w:tcPr>
-            <w:tcW w:type="dxa" w:w="4320"/>
+            <w:tcW w:type="dxa" w:w="2910"/>
+            <w:tcBorders>
+              <w:start w:sz="3.1999999999999886" w:val="single" w:color="#000000"/>
+              <w:top w:sz="3.199999999999818" w:val="single" w:color="#000000"/>
+              <w:end w:sz="4.0" w:val="single" w:color="#000000"/>
+              <w:bottom w:sz="4.0" w:val="single" w:color="#000000"/>
+            </w:tcBorders>
+            <w:shd w:fill="f1f2f1"/>
+            <w:tcMar>
+              <w:start w:w="0" w:type="dxa"/>
+              <w:end w:w="0" w:type="dxa"/>
+            </w:tcMar>
           </w:tcPr>
           <w:p>
+            <w:pPr>
+              <w:autoSpaceDN w:val="0"/>
+              <w:autoSpaceDE w:val="0"/>
+              <w:widowControl/>
+              <w:spacing w:line="197" w:lineRule="auto" w:before="122" w:after="0"/>
+              <w:ind w:left="104" w:right="0" w:firstLine="0"/>
+              <w:jc w:val="left"/>
+            </w:pPr>
             <w:r>
-              <w:t>ID of Vacating Employee / رقم الموظف المغادر</w:t>
+              <w:rPr>
+                <w:rFonts w:ascii="Calibri" w:hAnsi="Calibri" w:eastAsia="Calibri"/>
+                <w:b/>
+                <w:i w:val="0"/>
+                <w:color w:val="000000"/>
+                <w:sz w:val="20"/>
+              </w:rPr>
+              <w:t xml:space="preserve">ID of Vacating Employee </w:t>
             </w:r>
           </w:p>
         </w:tc>
         <w:tc>
           <w:tcPr>
-            <w:tcW w:type="dxa" w:w="4320"/>
+            <w:tcW w:type="dxa" w:w="7618"/>
+            <w:gridSpan w:val="6"/>
+            <w:tcBorders>
+              <w:start w:sz="4.0" w:val="single" w:color="#000000"/>
+              <w:top w:sz="3.199999999999818" w:val="single" w:color="#000000"/>
+              <w:end w:sz="4.0" w:val="single" w:color="#000000"/>
+              <w:bottom w:sz="4.0" w:val="single" w:color="#000000"/>
+            </w:tcBorders>
+            <w:tcMar>
+              <w:start w:w="0" w:type="dxa"/>
+              <w:end w:w="0" w:type="dxa"/>
+            </w:tcMar>
+            <w:tcMar>
+              <w:start w:w="0" w:type="dxa"/>
+              <w:end w:w="0" w:type="dxa"/>
+            </w:tcMar>
+            <w:tcMar>
+              <w:start w:w="0" w:type="dxa"/>
+              <w:end w:w="0" w:type="dxa"/>
+            </w:tcMar>
+            <w:tcMar>
+              <w:start w:w="0" w:type="dxa"/>
+              <w:end w:w="0" w:type="dxa"/>
+            </w:tcMar>
+            <w:tcMar>
+              <w:start w:w="0" w:type="dxa"/>
+              <w:end w:w="0" w:type="dxa"/>
+            </w:tcMar>
+            <w:tcMar>
+              <w:start w:w="0" w:type="dxa"/>
+              <w:end w:w="0" w:type="dxa"/>
+            </w:tcMar>
           </w:tcPr>
           <w:p>
             <w:r>
-              <w:rPr>
-                <w:sz w:val="20"/>
-              </w:rPr>
               <w:t>{{ vacating_employee_id }}</w:t>
             </w:r>
           </w:p>
         </w:tc>
       </w:tr>
       <w:tr>
+        <w:trPr>
+          <w:trHeight w:hRule="exact" w:val="410"/>
+        </w:trPr>
         <w:tc>
           <w:tcPr>
-            <w:tcW w:type="dxa" w:w="4320"/>
+            <w:tcW w:type="dxa" w:w="2910"/>
+            <w:tcBorders>
+              <w:start w:sz="3.1999999999999886" w:val="single" w:color="#000000"/>
+              <w:top w:sz="4.0" w:val="single" w:color="#000000"/>
+              <w:end w:sz="4.0" w:val="single" w:color="#000000"/>
+              <w:bottom w:sz="4.0" w:val="single" w:color="#000000"/>
+            </w:tcBorders>
+            <w:shd w:fill="f1f2f1"/>
+            <w:tcMar>
+              <w:start w:w="0" w:type="dxa"/>
+              <w:end w:w="0" w:type="dxa"/>
+            </w:tcMar>
           </w:tcPr>
           <w:p>
+            <w:pPr>
+              <w:autoSpaceDN w:val="0"/>
+              <w:autoSpaceDE w:val="0"/>
+              <w:widowControl/>
+              <w:spacing w:line="194" w:lineRule="auto" w:before="122" w:after="0"/>
+              <w:ind w:left="104" w:right="0" w:firstLine="0"/>
+              <w:jc w:val="left"/>
+            </w:pPr>
             <w:r>
-              <w:t>Last Working Day / آخر يوم عمل</w:t>
+              <w:rPr>
+                <w:rFonts w:ascii="Calibri" w:hAnsi="Calibri" w:eastAsia="Calibri"/>
+                <w:b/>
+                <w:i w:val="0"/>
+                <w:color w:val="000000"/>
+                <w:sz w:val="20"/>
+              </w:rPr>
+              <w:t xml:space="preserve">Last Working Day </w:t>
             </w:r>
           </w:p>
         </w:tc>
         <w:tc>
           <w:tcPr>
-            <w:tcW w:type="dxa" w:w="4320"/>
+            <w:tcW w:type="dxa" w:w="7618"/>
+            <w:gridSpan w:val="6"/>
+            <w:tcBorders>
+              <w:start w:sz="4.0" w:val="single" w:color="#000000"/>
+              <w:top w:sz="4.0" w:val="single" w:color="#000000"/>
+              <w:end w:sz="4.0" w:val="single" w:color="#000000"/>
+              <w:bottom w:sz="4.0" w:val="single" w:color="#000000"/>
+            </w:tcBorders>
+            <w:tcMar>
+              <w:start w:w="0" w:type="dxa"/>
+              <w:end w:w="0" w:type="dxa"/>
+            </w:tcMar>
+            <w:tcMar>
+              <w:start w:w="0" w:type="dxa"/>
+              <w:end w:w="0" w:type="dxa"/>
+            </w:tcMar>
+            <w:tcMar>
+              <w:start w:w="0" w:type="dxa"/>
+              <w:end w:w="0" w:type="dxa"/>
+            </w:tcMar>
+            <w:tcMar>
+              <w:start w:w="0" w:type="dxa"/>
+              <w:end w:w="0" w:type="dxa"/>
+            </w:tcMar>
+            <w:tcMar>
+              <w:start w:w="0" w:type="dxa"/>
+              <w:end w:w="0" w:type="dxa"/>
+            </w:tcMar>
+            <w:tcMar>
+              <w:start w:w="0" w:type="dxa"/>
+              <w:end w:w="0" w:type="dxa"/>
+            </w:tcMar>
           </w:tcPr>
           <w:p>
             <w:r>
-              <w:rPr>
-                <w:sz w:val="20"/>
-              </w:rPr>
               <w:t>{{ last_working_day }}</w:t>
             </w:r>
           </w:p>
         </w:tc>
       </w:tr>
       <w:tr>
+        <w:trPr>
+          <w:trHeight w:hRule="exact" w:val="414"/>
+        </w:trPr>
         <w:tc>
           <w:tcPr>
-            <w:tcW w:type="dxa" w:w="4320"/>
+            <w:tcW w:type="dxa" w:w="2910"/>
+            <w:tcBorders>
+              <w:start w:sz="3.1999999999999886" w:val="single" w:color="#000000"/>
+              <w:top w:sz="4.0" w:val="single" w:color="#000000"/>
+              <w:end w:sz="4.0" w:val="single" w:color="#000000"/>
+              <w:bottom w:sz="4.0" w:val="single" w:color="#000000"/>
+            </w:tcBorders>
+            <w:shd w:fill="f1f2f1"/>
+            <w:tcMar>
+              <w:start w:w="0" w:type="dxa"/>
+              <w:end w:w="0" w:type="dxa"/>
+            </w:tcMar>
           </w:tcPr>
           <w:p>
+            <w:pPr>
+              <w:autoSpaceDN w:val="0"/>
+              <w:autoSpaceDE w:val="0"/>
+              <w:widowControl/>
+              <w:spacing w:line="197" w:lineRule="auto" w:before="124" w:after="0"/>
+              <w:ind w:left="104" w:right="0" w:firstLine="0"/>
+              <w:jc w:val="left"/>
+            </w:pPr>
             <w:r>
-              <w:t>Reason for Replacement / سبب الإحلال</w:t>
+              <w:rPr>
+                <w:rFonts w:ascii="Calibri" w:hAnsi="Calibri" w:eastAsia="Calibri"/>
+                <w:b/>
+                <w:i w:val="0"/>
+                <w:color w:val="000000"/>
+                <w:sz w:val="20"/>
+              </w:rPr>
+              <w:t xml:space="preserve">Reason for replacement </w:t>
             </w:r>
           </w:p>
         </w:tc>
         <w:tc>
           <w:tcPr>
-            <w:tcW w:type="dxa" w:w="4320"/>
+            <w:tcW w:type="dxa" w:w="7618"/>
+            <w:gridSpan w:val="6"/>
+            <w:tcBorders>
+              <w:start w:sz="4.0" w:val="single" w:color="#000000"/>
+              <w:top w:sz="4.0" w:val="single" w:color="#000000"/>
+              <w:end w:sz="4.0" w:val="single" w:color="#000000"/>
+              <w:bottom w:sz="4.0" w:val="single" w:color="#000000"/>
+            </w:tcBorders>
+            <w:tcMar>
+              <w:start w:w="0" w:type="dxa"/>
+              <w:end w:w="0" w:type="dxa"/>
+            </w:tcMar>
+            <w:tcMar>
+              <w:start w:w="0" w:type="dxa"/>
+              <w:end w:w="0" w:type="dxa"/>
+            </w:tcMar>
+            <w:tcMar>
+              <w:start w:w="0" w:type="dxa"/>
+              <w:end w:w="0" w:type="dxa"/>
+            </w:tcMar>
+            <w:tcMar>
+              <w:start w:w="0" w:type="dxa"/>
+              <w:end w:w="0" w:type="dxa"/>
+            </w:tcMar>
+            <w:tcMar>
+              <w:start w:w="0" w:type="dxa"/>
+              <w:end w:w="0" w:type="dxa"/>
+            </w:tcMar>
+            <w:tcMar>
+              <w:start w:w="0" w:type="dxa"/>
+              <w:end w:w="0" w:type="dxa"/>
+            </w:tcMar>
           </w:tcPr>
           <w:p>
             <w:r>
-              <w:rPr>
-                <w:sz w:val="20"/>
-              </w:rPr>
               <w:t>{{ replacement_reason }}</w:t>
             </w:r>
           </w:p>
         </w:tc>
       </w:tr>
+    </w:tbl>
+    <w:p>
+      <w:pPr>
+        <w:autoSpaceDN w:val="0"/>
+        <w:autoSpaceDE w:val="0"/>
+        <w:widowControl/>
+        <w:spacing w:line="122" w:lineRule="exact" w:before="0" w:after="0"/>
+        <w:ind w:left="0" w:right="0"/>
+      </w:pPr>
+    </w:p>
+    <w:tbl>
+      <w:tblPr>
+        <w:tblW w:type="auto" w:w="0"/>
+        <w:tblLayout w:type="fixed"/>
+        <w:tblLook w:firstColumn="1" w:firstRow="1" w:lastColumn="0" w:lastRow="0" w:noHBand="0" w:noVBand="1" w:val="04A0"/>
+        <w:tblInd w:w="816.0" w:type="dxa"/>
+      </w:tblPr>
+      <w:tblGrid>
+        <w:gridCol w:w="1289"/>
+        <w:gridCol w:w="1289"/>
+        <w:gridCol w:w="1289"/>
+        <w:gridCol w:w="1289"/>
+        <w:gridCol w:w="1289"/>
+        <w:gridCol w:w="1289"/>
+        <w:gridCol w:w="1289"/>
+      </w:tblGrid>
       <w:tr>
+        <w:trPr>
+          <w:trHeight w:hRule="exact" w:val="360"/>
+        </w:trPr>
         <w:tc>
           <w:tcPr>
-            <w:tcW w:type="dxa" w:w="4320"/>
+            <w:tcW w:type="dxa" w:w="10528"/>
+            <w:gridSpan w:val="7"/>
+            <w:tcBorders>
+              <w:start w:sz="3.1999999999999886" w:val="single" w:color="#000000"/>
+              <w:top w:sz="4.0" w:val="single" w:color="#000000"/>
+              <w:end w:sz="4.0" w:val="single" w:color="#000000"/>
+              <w:bottom w:sz="4.0" w:val="single" w:color="#000000"/>
+            </w:tcBorders>
+            <w:shd w:fill="c00000"/>
+            <w:tcMar>
+              <w:start w:w="0" w:type="dxa"/>
+              <w:end w:w="0" w:type="dxa"/>
+            </w:tcMar>
+            <w:tcMar>
+              <w:start w:w="0" w:type="dxa"/>
+              <w:end w:w="0" w:type="dxa"/>
+            </w:tcMar>
+            <w:tcMar>
+              <w:start w:w="0" w:type="dxa"/>
+              <w:end w:w="0" w:type="dxa"/>
+            </w:tcMar>
+            <w:tcMar>
+              <w:start w:w="0" w:type="dxa"/>
+              <w:end w:w="0" w:type="dxa"/>
+            </w:tcMar>
+            <w:tcMar>
+              <w:start w:w="0" w:type="dxa"/>
+              <w:end w:w="0" w:type="dxa"/>
+            </w:tcMar>
+            <w:tcMar>
+              <w:start w:w="0" w:type="dxa"/>
+              <w:end w:w="0" w:type="dxa"/>
+            </w:tcMar>
+            <w:tcMar>
+              <w:start w:w="0" w:type="dxa"/>
+              <w:end w:w="0" w:type="dxa"/>
+            </w:tcMar>
           </w:tcPr>
           <w:p>
+            <w:pPr>
+              <w:autoSpaceDN w:val="0"/>
+              <w:autoSpaceDE w:val="0"/>
+              <w:widowControl/>
+              <w:spacing w:line="230" w:lineRule="auto" w:before="48" w:after="0"/>
+              <w:ind w:left="0" w:right="0" w:firstLine="0"/>
+              <w:jc w:val="center"/>
+            </w:pPr>
             <w:r>
-              <w:t>Essential Job Functions / المهام الوظيفية الأساسية</w:t>
+              <w:rPr>
+                <w:rFonts w:ascii="Univers" w:hAnsi="Univers" w:eastAsia="Univers"/>
+                <w:b/>
+                <w:i w:val="0"/>
+                <w:color w:val="FFFFFF"/>
+                <w:sz w:val="20"/>
+              </w:rPr>
+              <w:t xml:space="preserve">Job Requirements </w:t>
+            </w:r>
+          </w:p>
+        </w:tc>
+      </w:tr>
+      <w:tr>
+        <w:trPr>
+          <w:trHeight w:hRule="exact" w:val="776"/>
+        </w:trPr>
+        <w:tc>
+          <w:tcPr>
+            <w:tcW w:type="dxa" w:w="2868"/>
+            <w:tcBorders>
+              <w:start w:sz="3.1999999999999886" w:val="single" w:color="#000000"/>
+              <w:top w:sz="4.0" w:val="single" w:color="#000000"/>
+              <w:end w:sz="4.0" w:val="single" w:color="#000000"/>
+              <w:bottom w:sz="4.0" w:val="single" w:color="#000000"/>
+            </w:tcBorders>
+            <w:shd w:fill="f1f2f1"/>
+            <w:tcMar>
+              <w:start w:w="0" w:type="dxa"/>
+              <w:end w:w="0" w:type="dxa"/>
+            </w:tcMar>
+          </w:tcPr>
+          <w:p>
+            <w:pPr>
+              <w:autoSpaceDN w:val="0"/>
+              <w:autoSpaceDE w:val="0"/>
+              <w:widowControl/>
+              <w:spacing w:line="194" w:lineRule="auto" w:before="300" w:after="0"/>
+              <w:ind w:left="104" w:right="0" w:firstLine="0"/>
+              <w:jc w:val="left"/>
+            </w:pPr>
+            <w:r>
+              <w:rPr>
+                <w:rFonts w:ascii="Calibri" w:hAnsi="Calibri" w:eastAsia="Calibri"/>
+                <w:b/>
+                <w:i w:val="0"/>
+                <w:color w:val="000000"/>
+                <w:sz w:val="20"/>
+              </w:rPr>
+              <w:t xml:space="preserve">Essential Job Functions </w:t>
             </w:r>
           </w:p>
         </w:tc>
         <w:tc>
           <w:tcPr>
-            <w:tcW w:type="dxa" w:w="4320"/>
+            <w:tcW w:type="dxa" w:w="7660"/>
+            <w:gridSpan w:val="6"/>
+            <w:tcBorders>
+              <w:start w:sz="4.0" w:val="single" w:color="#000000"/>
+              <w:top w:sz="4.0" w:val="single" w:color="#000000"/>
+              <w:end w:sz="4.0" w:val="single" w:color="#000000"/>
+              <w:bottom w:sz="4.0" w:val="single" w:color="#000000"/>
+            </w:tcBorders>
+            <w:tcMar>
+              <w:start w:w="0" w:type="dxa"/>
+              <w:end w:w="0" w:type="dxa"/>
+            </w:tcMar>
+            <w:tcMar>
+              <w:start w:w="0" w:type="dxa"/>
+              <w:end w:w="0" w:type="dxa"/>
+            </w:tcMar>
+            <w:tcMar>
+              <w:start w:w="0" w:type="dxa"/>
+              <w:end w:w="0" w:type="dxa"/>
+            </w:tcMar>
+            <w:tcMar>
+              <w:start w:w="0" w:type="dxa"/>
+              <w:end w:w="0" w:type="dxa"/>
+            </w:tcMar>
+            <w:tcMar>
+              <w:start w:w="0" w:type="dxa"/>
+              <w:end w:w="0" w:type="dxa"/>
+            </w:tcMar>
+            <w:tcMar>
+              <w:start w:w="0" w:type="dxa"/>
+              <w:end w:w="0" w:type="dxa"/>
+            </w:tcMar>
           </w:tcPr>
           <w:p>
             <w:r>
-              <w:rPr>
-                <w:sz w:val="20"/>
-              </w:rPr>
               <w:t>{{ essential_functions }}</w:t>
             </w:r>
           </w:p>
         </w:tc>
       </w:tr>
       <w:tr>
+        <w:trPr>
+          <w:trHeight w:hRule="exact" w:val="416"/>
+        </w:trPr>
         <w:tc>
           <w:tcPr>
-            <w:tcW w:type="dxa" w:w="4320"/>
+            <w:tcW w:type="dxa" w:w="2868"/>
+            <w:tcBorders>
+              <w:start w:sz="3.1999999999999886" w:val="single" w:color="#000000"/>
+              <w:top w:sz="4.0" w:val="single" w:color="#000000"/>
+              <w:end w:sz="4.0" w:val="single" w:color="#000000"/>
+              <w:bottom w:sz="4.0" w:val="single" w:color="#000000"/>
+            </w:tcBorders>
+            <w:shd w:fill="f1f2f1"/>
+            <w:tcMar>
+              <w:start w:w="0" w:type="dxa"/>
+              <w:end w:w="0" w:type="dxa"/>
+            </w:tcMar>
           </w:tcPr>
           <w:p>
+            <w:pPr>
+              <w:autoSpaceDN w:val="0"/>
+              <w:autoSpaceDE w:val="0"/>
+              <w:widowControl/>
+              <w:spacing w:line="194" w:lineRule="auto" w:before="122" w:after="0"/>
+              <w:ind w:left="104" w:right="0" w:firstLine="0"/>
+              <w:jc w:val="left"/>
+            </w:pPr>
             <w:r>
-              <w:t>Educational Qualification / المؤهل العلمي</w:t>
+              <w:rPr>
+                <w:rFonts w:ascii="Calibri" w:hAnsi="Calibri" w:eastAsia="Calibri"/>
+                <w:b/>
+                <w:i w:val="0"/>
+                <w:color w:val="000000"/>
+                <w:sz w:val="20"/>
+              </w:rPr>
+              <w:t xml:space="preserve">Educational Qualification </w:t>
             </w:r>
           </w:p>
         </w:tc>
         <w:tc>
           <w:tcPr>
-            <w:tcW w:type="dxa" w:w="4320"/>
+            <w:tcW w:type="dxa" w:w="7660"/>
+            <w:gridSpan w:val="6"/>
+            <w:tcBorders>
+              <w:start w:sz="4.0" w:val="single" w:color="#000000"/>
+              <w:top w:sz="4.0" w:val="single" w:color="#000000"/>
+              <w:end w:sz="4.0" w:val="single" w:color="#000000"/>
+              <w:bottom w:sz="4.0" w:val="single" w:color="#000000"/>
+            </w:tcBorders>
+            <w:tcMar>
+              <w:start w:w="0" w:type="dxa"/>
+              <w:end w:w="0" w:type="dxa"/>
+            </w:tcMar>
+            <w:tcMar>
+              <w:start w:w="0" w:type="dxa"/>
+              <w:end w:w="0" w:type="dxa"/>
+            </w:tcMar>
+            <w:tcMar>
+              <w:start w:w="0" w:type="dxa"/>
+              <w:end w:w="0" w:type="dxa"/>
+            </w:tcMar>
+            <w:tcMar>
+              <w:start w:w="0" w:type="dxa"/>
+              <w:end w:w="0" w:type="dxa"/>
+            </w:tcMar>
+            <w:tcMar>
+              <w:start w:w="0" w:type="dxa"/>
+              <w:end w:w="0" w:type="dxa"/>
+            </w:tcMar>
+            <w:tcMar>
+              <w:start w:w="0" w:type="dxa"/>
+              <w:end w:w="0" w:type="dxa"/>
+            </w:tcMar>
           </w:tcPr>
           <w:p>
             <w:r>
-              <w:rPr>
-                <w:sz w:val="20"/>
-              </w:rPr>
               <w:t>{{ education_qualification }}</w:t>
             </w:r>
           </w:p>
         </w:tc>
       </w:tr>
       <w:tr>
+        <w:trPr>
+          <w:trHeight w:hRule="exact" w:val="420"/>
+        </w:trPr>
         <w:tc>
           <w:tcPr>
-            <w:tcW w:type="dxa" w:w="4320"/>
+            <w:tcW w:type="dxa" w:w="2868"/>
+            <w:tcBorders>
+              <w:start w:sz="3.1999999999999886" w:val="single" w:color="#000000"/>
+              <w:top w:sz="4.0" w:val="single" w:color="#000000"/>
+              <w:end w:sz="4.0" w:val="single" w:color="#000000"/>
+              <w:bottom w:sz="4.0" w:val="single" w:color="#000000"/>
+            </w:tcBorders>
+            <w:shd w:fill="f1f2f1"/>
+            <w:tcMar>
+              <w:start w:w="0" w:type="dxa"/>
+              <w:end w:w="0" w:type="dxa"/>
+            </w:tcMar>
           </w:tcPr>
           <w:p>
+            <w:pPr>
+              <w:autoSpaceDN w:val="0"/>
+              <w:autoSpaceDE w:val="0"/>
+              <w:widowControl/>
+              <w:spacing w:line="194" w:lineRule="auto" w:before="128" w:after="0"/>
+              <w:ind w:left="104" w:right="0" w:firstLine="0"/>
+              <w:jc w:val="left"/>
+            </w:pPr>
             <w:r>
-              <w:t>Skills Required / المهارات المطلوبة</w:t>
+              <w:rPr>
+                <w:rFonts w:ascii="Calibri" w:hAnsi="Calibri" w:eastAsia="Calibri"/>
+                <w:b/>
+                <w:i w:val="0"/>
+                <w:color w:val="000000"/>
+                <w:sz w:val="20"/>
+              </w:rPr>
+              <w:t xml:space="preserve">Skills Required </w:t>
             </w:r>
           </w:p>
         </w:tc>
         <w:tc>
           <w:tcPr>
-            <w:tcW w:type="dxa" w:w="4320"/>
+            <w:tcW w:type="dxa" w:w="7660"/>
+            <w:gridSpan w:val="6"/>
+            <w:tcBorders>
+              <w:start w:sz="4.0" w:val="single" w:color="#000000"/>
+              <w:top w:sz="4.0" w:val="single" w:color="#000000"/>
+              <w:end w:sz="4.0" w:val="single" w:color="#000000"/>
+              <w:bottom w:sz="4.0" w:val="single" w:color="#000000"/>
+            </w:tcBorders>
+            <w:tcMar>
+              <w:start w:w="0" w:type="dxa"/>
+              <w:end w:w="0" w:type="dxa"/>
+            </w:tcMar>
+            <w:tcMar>
+              <w:start w:w="0" w:type="dxa"/>
+              <w:end w:w="0" w:type="dxa"/>
+            </w:tcMar>
+            <w:tcMar>
+              <w:start w:w="0" w:type="dxa"/>
+              <w:end w:w="0" w:type="dxa"/>
+            </w:tcMar>
+            <w:tcMar>
+              <w:start w:w="0" w:type="dxa"/>
+              <w:end w:w="0" w:type="dxa"/>
+            </w:tcMar>
+            <w:tcMar>
+              <w:start w:w="0" w:type="dxa"/>
+              <w:end w:w="0" w:type="dxa"/>
+            </w:tcMar>
+            <w:tcMar>
+              <w:start w:w="0" w:type="dxa"/>
+              <w:end w:w="0" w:type="dxa"/>
+            </w:tcMar>
           </w:tcPr>
           <w:p>
             <w:r>
-              <w:rPr>
-                <w:sz w:val="20"/>
-              </w:rPr>
               <w:t>{{ skills_required }}</w:t>
             </w:r>
           </w:p>
         </w:tc>
       </w:tr>
       <w:tr>
+        <w:trPr>
+          <w:trHeight w:hRule="exact" w:val="506"/>
+        </w:trPr>
         <w:tc>
           <w:tcPr>
-            <w:tcW w:type="dxa" w:w="4320"/>
+            <w:tcW w:type="dxa" w:w="2868"/>
+            <w:tcBorders>
+              <w:start w:sz="3.1999999999999886" w:val="single" w:color="#000000"/>
+              <w:top w:sz="4.0" w:val="single" w:color="#000000"/>
+              <w:end w:sz="4.0" w:val="single" w:color="#000000"/>
+              <w:bottom w:sz="3.199999999999818" w:val="single" w:color="#000000"/>
+            </w:tcBorders>
+            <w:shd w:fill="f1f2f1"/>
+            <w:tcMar>
+              <w:start w:w="0" w:type="dxa"/>
+              <w:end w:w="0" w:type="dxa"/>
+            </w:tcMar>
           </w:tcPr>
           <w:p>
+            <w:pPr>
+              <w:autoSpaceDN w:val="0"/>
+              <w:autoSpaceDE w:val="0"/>
+              <w:widowControl/>
+              <w:spacing w:line="197" w:lineRule="auto" w:before="168" w:after="0"/>
+              <w:ind w:left="104" w:right="0" w:firstLine="0"/>
+              <w:jc w:val="left"/>
+            </w:pPr>
             <w:r>
-              <w:t>Experience (in Years) / الخبرة (بالسنوات)</w:t>
+              <w:rPr>
+                <w:rFonts w:ascii="Calibri" w:hAnsi="Calibri" w:eastAsia="Calibri"/>
+                <w:b/>
+                <w:i w:val="0"/>
+                <w:color w:val="000000"/>
+                <w:sz w:val="20"/>
+              </w:rPr>
+              <w:t xml:space="preserve">Experience (In Years) </w:t>
             </w:r>
           </w:p>
         </w:tc>
         <w:tc>
           <w:tcPr>
-            <w:tcW w:type="dxa" w:w="4320"/>
+            <w:tcW w:type="dxa" w:w="540"/>
+            <w:tcBorders>
+              <w:start w:sz="4.0" w:val="single" w:color="#000000"/>
+              <w:top w:sz="4.0" w:val="single" w:color="#000000"/>
+              <w:end w:sz="4.0" w:val="single" w:color="#000000"/>
+              <w:bottom w:sz="3.199999999999818" w:val="single" w:color="#000000"/>
+            </w:tcBorders>
+            <w:tcMar>
+              <w:start w:w="0" w:type="dxa"/>
+              <w:end w:w="0" w:type="dxa"/>
+            </w:tcMar>
           </w:tcPr>
           <w:p>
             <w:r>
-              <w:rPr>
-                <w:sz w:val="20"/>
-              </w:rPr>
               <w:t>{{ experience_years }}</w:t>
-            </w:r>
-          </w:p>
-        </w:tc>
-      </w:tr>
-      <w:tr>
-        <w:tc>
-          <w:tcPr>
-            <w:tcW w:type="dxa" w:w="4320"/>
-          </w:tcPr>
-          <w:p>
-            <w:r>
-              <w:t>Gender Preference / الجنس المفضل</w:t>
             </w:r>
           </w:p>
         </w:tc>
         <w:tc>
           <w:tcPr>
-            <w:tcW w:type="dxa" w:w="4320"/>
+            <w:tcW w:type="dxa" w:w="1448"/>
+            <w:tcBorders>
+              <w:start w:sz="4.0" w:val="single" w:color="#000000"/>
+              <w:top w:sz="4.0" w:val="single" w:color="#000000"/>
+              <w:end w:sz="4.0" w:val="single" w:color="#000000"/>
+              <w:bottom w:sz="3.199999999999818" w:val="single" w:color="#000000"/>
+            </w:tcBorders>
+            <w:shd w:fill="f1f2f1"/>
+            <w:tcMar>
+              <w:start w:w="0" w:type="dxa"/>
+              <w:end w:w="0" w:type="dxa"/>
+            </w:tcMar>
           </w:tcPr>
           <w:p>
+            <w:pPr>
+              <w:autoSpaceDN w:val="0"/>
+              <w:autoSpaceDE w:val="0"/>
+              <w:widowControl/>
+              <w:spacing w:line="245" w:lineRule="auto" w:before="48" w:after="0"/>
+              <w:ind w:left="102" w:right="288" w:firstLine="0"/>
+              <w:jc w:val="left"/>
+            </w:pPr>
             <w:r>
               <w:rPr>
+                <w:rFonts w:ascii="Calibri" w:hAnsi="Calibri" w:eastAsia="Calibri"/>
+                <w:b/>
+                <w:i w:val="0"/>
+                <w:color w:val="000000"/>
                 <w:sz w:val="20"/>
               </w:rPr>
-              <w:t>{{ gender_preference }}</w:t>
+              <w:t xml:space="preserve">Gender </w:t>
             </w:r>
-          </w:p>
-        </w:tc>
-      </w:tr>
-      <w:tr>
-        <w:tc>
-          <w:tcPr>
-            <w:tcW w:type="dxa" w:w="4320"/>
-          </w:tcPr>
-          <w:p>
             <w:r>
-              <w:t>Expected Joining Date / تاريخ الالتحاق المتوقع</w:t>
+              <w:br/>
+            </w:r>
+            <w:r>
+              <w:rPr>
+                <w:rFonts w:ascii="Calibri" w:hAnsi="Calibri" w:eastAsia="Calibri"/>
+                <w:b/>
+                <w:i w:val="0"/>
+                <w:color w:val="000000"/>
+                <w:sz w:val="20"/>
+              </w:rPr>
+              <w:t xml:space="preserve">Preference </w:t>
             </w:r>
           </w:p>
         </w:tc>
         <w:tc>
           <w:tcPr>
-            <w:tcW w:type="dxa" w:w="4320"/>
+            <w:tcW w:type="dxa" w:w="1710"/>
+            <w:tcBorders>
+              <w:start w:sz="4.0" w:val="single" w:color="#000000"/>
+              <w:top w:sz="4.0" w:val="single" w:color="#000000"/>
+              <w:end w:sz="4.0" w:val="single" w:color="#000000"/>
+              <w:bottom w:sz="3.199999999999818" w:val="single" w:color="#000000"/>
+            </w:tcBorders>
+            <w:tcMar>
+              <w:start w:w="0" w:type="dxa"/>
+              <w:end w:w="0" w:type="dxa"/>
+            </w:tcMar>
+          </w:tcPr>
+          <w:p>
+            <w:pPr>
+              <w:autoSpaceDN w:val="0"/>
+              <w:autoSpaceDE w:val="0"/>
+              <w:widowControl/>
+              <w:spacing w:line="245" w:lineRule="auto" w:before="30" w:after="0"/>
+              <w:ind w:left="100" w:right="720" w:firstLine="0"/>
+              <w:jc w:val="left"/>
+            </w:pPr>
+            <w:r>
+              <w:rPr>
+                <w:rFonts w:ascii="Arial" w:hAnsi="Arial" w:eastAsia="Wingdings 2"/>
+                <w:b w:val="0"/>
+                <w:i w:val="0"/>
+                <w:color w:val="000000"/>
+                <w:sz w:val="20"/>
+              </w:rPr>
+              <w:t>{{ '☑' if gender_preference == 'Male' else '☐' }}</w:t>
+            </w:r>
+            <w:r>
+              <w:rPr>
+                <w:rFonts w:ascii="Calibri" w:hAnsi="Calibri" w:eastAsia="Calibri"/>
+                <w:b w:val="0"/>
+                <w:i w:val="0"/>
+                <w:color w:val="000000"/>
+                <w:sz w:val="20"/>
+              </w:rPr>
+              <w:t>Male</w:t>
+            </w:r>
+            <w:r>
+              <w:br/>
+            </w:r>
+            <w:r>
+              <w:rPr>
+                <w:rFonts w:ascii="Arial" w:hAnsi="Arial" w:eastAsia="Wingdings 2"/>
+                <w:b w:val="0"/>
+                <w:i w:val="0"/>
+                <w:color w:val="000000"/>
+                <w:sz w:val="20"/>
+              </w:rPr>
+              <w:t>{{ '☑' if gender_preference == 'Female' else '☐' }}</w:t>
+            </w:r>
+            <w:r>
+              <w:rPr>
+                <w:rFonts w:ascii="Calibri" w:hAnsi="Calibri" w:eastAsia="Calibri"/>
+                <w:b w:val="0"/>
+                <w:i w:val="0"/>
+                <w:color w:val="000000"/>
+                <w:sz w:val="20"/>
+              </w:rPr>
+              <w:t>Female</w:t>
+            </w:r>
+            <w:r/>
+          </w:p>
+        </w:tc>
+        <w:tc>
+          <w:tcPr>
+            <w:tcW w:type="dxa" w:w="1442"/>
+            <w:tcBorders>
+              <w:start w:sz="4.0" w:val="single" w:color="#000000"/>
+              <w:top w:sz="4.0" w:val="single" w:color="#000000"/>
+              <w:end w:sz="4.0" w:val="single" w:color="#000000"/>
+              <w:bottom w:sz="3.199999999999818" w:val="single" w:color="#000000"/>
+            </w:tcBorders>
+            <w:shd w:fill="f1f2f1"/>
+            <w:tcMar>
+              <w:start w:w="0" w:type="dxa"/>
+              <w:end w:w="0" w:type="dxa"/>
+            </w:tcMar>
+          </w:tcPr>
+          <w:tbl>
+            <w:tblPr>
+              <w:tblW w:type="auto" w:w="0"/>
+              <w:tblLayout w:type="fixed"/>
+              <w:tblLook w:firstColumn="1" w:firstRow="1" w:lastColumn="0" w:lastRow="0" w:noHBand="0" w:noVBand="1" w:val="04A0"/>
+              <w:tblInd w:w="102.00000000000045" w:type="dxa"/>
+            </w:tblPr>
+            <w:tblGrid>
+              <w:gridCol w:w="1442"/>
+            </w:tblGrid>
+            <w:tr>
+              <w:trPr>
+                <w:trHeight w:hRule="exact" w:val="244"/>
+              </w:trPr>
+              <w:tc>
+                <w:tcPr>
+                  <w:tcW w:type="dxa" w:w="1224"/>
+                  <w:tcBorders/>
+                  <w:shd w:fill="f1f2f1"/>
+                  <w:tcMar>
+                    <w:start w:w="0" w:type="dxa"/>
+                    <w:end w:w="0" w:type="dxa"/>
+                  </w:tcMar>
+                </w:tcPr>
+                <w:p>
+                  <w:pPr>
+                    <w:autoSpaceDN w:val="0"/>
+                    <w:autoSpaceDE w:val="0"/>
+                    <w:widowControl/>
+                    <w:spacing w:line="197" w:lineRule="auto" w:before="42" w:after="0"/>
+                    <w:ind w:left="0" w:right="0" w:firstLine="0"/>
+                    <w:jc w:val="left"/>
+                  </w:pPr>
+                  <w:r>
+                    <w:rPr>
+                      <w:rFonts w:ascii="Calibri" w:hAnsi="Calibri" w:eastAsia="Calibri"/>
+                      <w:b/>
+                      <w:i w:val="0"/>
+                      <w:color w:val="000000"/>
+                      <w:sz w:val="20"/>
+                    </w:rPr>
+                    <w:t xml:space="preserve">Expected </w:t>
+                  </w:r>
+                </w:p>
+              </w:tc>
+            </w:tr>
+          </w:tbl>
+          <w:p>
+            <w:pPr>
+              <w:autoSpaceDN w:val="0"/>
+              <w:autoSpaceDE w:val="0"/>
+              <w:widowControl/>
+              <w:spacing w:line="20" w:lineRule="exact" w:before="0" w:after="0"/>
+              <w:ind w:left="0" w:right="0"/>
+            </w:pPr>
+          </w:p>
+          <w:tbl>
+            <w:tblPr>
+              <w:tblW w:type="auto" w:w="0"/>
+              <w:tblLayout w:type="fixed"/>
+              <w:tblLook w:firstColumn="1" w:firstRow="1" w:lastColumn="0" w:lastRow="0" w:noHBand="0" w:noVBand="1" w:val="04A0"/>
+              <w:tblInd w:w="102.00000000000045" w:type="dxa"/>
+            </w:tblPr>
+            <w:tblGrid>
+              <w:gridCol w:w="1442"/>
+            </w:tblGrid>
+            <w:tr>
+              <w:trPr>
+                <w:trHeight w:hRule="exact" w:val="222"/>
+              </w:trPr>
+              <w:tc>
+                <w:tcPr>
+                  <w:tcW w:type="dxa" w:w="1224"/>
+                  <w:tcBorders/>
+                  <w:shd w:fill="f1f2f1"/>
+                  <w:tcMar>
+                    <w:start w:w="0" w:type="dxa"/>
+                    <w:end w:w="0" w:type="dxa"/>
+                  </w:tcMar>
+                </w:tcPr>
+                <w:p>
+                  <w:pPr>
+                    <w:autoSpaceDN w:val="0"/>
+                    <w:autoSpaceDE w:val="0"/>
+                    <w:widowControl/>
+                    <w:spacing w:line="197" w:lineRule="auto" w:before="40" w:after="0"/>
+                    <w:ind w:left="0" w:right="0" w:firstLine="0"/>
+                    <w:jc w:val="left"/>
+                  </w:pPr>
+                  <w:r>
+                    <w:rPr>
+                      <w:rFonts w:ascii="Calibri" w:hAnsi="Calibri" w:eastAsia="Calibri"/>
+                      <w:b/>
+                      <w:i w:val="0"/>
+                      <w:color w:val="000000"/>
+                      <w:sz w:val="20"/>
+                    </w:rPr>
+                    <w:t>Joining Date</w:t>
+                  </w:r>
+                </w:p>
+              </w:tc>
+            </w:tr>
+          </w:tbl>
+          <w:p>
+            <w:pPr>
+              <w:autoSpaceDN w:val="0"/>
+              <w:autoSpaceDE w:val="0"/>
+              <w:widowControl/>
+              <w:spacing w:line="14" w:lineRule="exact" w:before="0" w:after="0"/>
+              <w:ind w:left="0" w:right="0"/>
+            </w:pPr>
+          </w:p>
+          <w:p>
+            <w:pPr>
+              <w:autoSpaceDN w:val="0"/>
+              <w:autoSpaceDE w:val="0"/>
+              <w:widowControl/>
+              <w:spacing w:line="14" w:lineRule="exact" w:before="0" w:after="0"/>
+              <w:ind w:left="0" w:right="0"/>
+            </w:pPr>
+          </w:p>
+        </w:tc>
+        <w:tc>
+          <w:tcPr>
+            <w:tcW w:type="dxa" w:w="2520"/>
+            <w:gridSpan w:val="2"/>
+            <w:tcBorders>
+              <w:start w:sz="4.0" w:val="single" w:color="#000000"/>
+              <w:top w:sz="4.0" w:val="single" w:color="#000000"/>
+              <w:end w:sz="4.0" w:val="single" w:color="#000000"/>
+              <w:bottom w:sz="3.199999999999818" w:val="single" w:color="#000000"/>
+            </w:tcBorders>
+            <w:tcMar>
+              <w:start w:w="0" w:type="dxa"/>
+              <w:end w:w="0" w:type="dxa"/>
+            </w:tcMar>
+            <w:tcMar>
+              <w:start w:w="0" w:type="dxa"/>
+              <w:end w:w="0" w:type="dxa"/>
+            </w:tcMar>
           </w:tcPr>
           <w:p>
             <w:r>
-              <w:rPr>
-                <w:sz w:val="20"/>
-              </w:rPr>
               <w:t>{{ expected_joining_date }}</w:t>
             </w:r>
           </w:p>
         </w:tc>
       </w:tr>
       <w:tr>
+        <w:trPr>
+          <w:trHeight w:hRule="exact" w:val="498"/>
+        </w:trPr>
         <w:tc>
           <w:tcPr>
-            <w:tcW w:type="dxa" w:w="4320"/>
+            <w:tcW w:type="dxa" w:w="2868"/>
+            <w:tcBorders>
+              <w:start w:sz="3.1999999999999886" w:val="single" w:color="#000000"/>
+              <w:top w:sz="3.199999999999818" w:val="single" w:color="#000000"/>
+              <w:end w:sz="4.0" w:val="single" w:color="#000000"/>
+              <w:bottom w:sz="4.0" w:val="single" w:color="#000000"/>
+            </w:tcBorders>
+            <w:shd w:fill="f1f2f1"/>
+            <w:tcMar>
+              <w:start w:w="0" w:type="dxa"/>
+              <w:end w:w="0" w:type="dxa"/>
+            </w:tcMar>
           </w:tcPr>
           <w:p>
+            <w:pPr>
+              <w:autoSpaceDN w:val="0"/>
+              <w:autoSpaceDE w:val="0"/>
+              <w:widowControl/>
+              <w:spacing w:line="197" w:lineRule="auto" w:before="166" w:after="0"/>
+              <w:ind w:left="104" w:right="0" w:firstLine="0"/>
+              <w:jc w:val="left"/>
+            </w:pPr>
             <w:r>
-              <w:t>Salary / الراتب</w:t>
+              <w:rPr>
+                <w:rFonts w:ascii="Calibri" w:hAnsi="Calibri" w:eastAsia="Calibri"/>
+                <w:b/>
+                <w:i w:val="0"/>
+                <w:color w:val="000000"/>
+                <w:sz w:val="20"/>
+              </w:rPr>
+              <w:t xml:space="preserve">Salary </w:t>
             </w:r>
           </w:p>
         </w:tc>
         <w:tc>
           <w:tcPr>
-            <w:tcW w:type="dxa" w:w="4320"/>
+            <w:tcW w:type="dxa" w:w="1988"/>
+            <w:gridSpan w:val="2"/>
+            <w:tcBorders>
+              <w:start w:sz="4.0" w:val="single" w:color="#000000"/>
+              <w:top w:sz="3.199999999999818" w:val="single" w:color="#000000"/>
+              <w:end w:sz="4.0" w:val="single" w:color="#000000"/>
+              <w:bottom w:sz="4.0" w:val="single" w:color="#000000"/>
+            </w:tcBorders>
+            <w:tcMar>
+              <w:start w:w="0" w:type="dxa"/>
+              <w:end w:w="0" w:type="dxa"/>
+            </w:tcMar>
+            <w:tcMar>
+              <w:start w:w="0" w:type="dxa"/>
+              <w:end w:w="0" w:type="dxa"/>
+            </w:tcMar>
           </w:tcPr>
           <w:p>
             <w:r>
-              <w:rPr>
-                <w:sz w:val="20"/>
-              </w:rPr>
               <w:t>{{ salary }}</w:t>
-            </w:r>
-          </w:p>
-        </w:tc>
-      </w:tr>
-      <w:tr>
-        <w:tc>
-          <w:tcPr>
-            <w:tcW w:type="dxa" w:w="4320"/>
-          </w:tcPr>
-          <w:p>
-            <w:r>
-              <w:t>Accommodation Provided / توفير السكن</w:t>
             </w:r>
           </w:p>
         </w:tc>
         <w:tc>
           <w:tcPr>
-            <w:tcW w:type="dxa" w:w="4320"/>
+            <w:tcW w:type="dxa" w:w="1710"/>
+            <w:tcBorders>
+              <w:start w:sz="4.0" w:val="single" w:color="#000000"/>
+              <w:top w:sz="3.199999999999818" w:val="single" w:color="#000000"/>
+              <w:end w:sz="4.0" w:val="single" w:color="#000000"/>
+              <w:bottom w:sz="4.0" w:val="single" w:color="#000000"/>
+            </w:tcBorders>
+            <w:shd w:fill="f1f2f1"/>
+            <w:tcMar>
+              <w:start w:w="0" w:type="dxa"/>
+              <w:end w:w="0" w:type="dxa"/>
+            </w:tcMar>
           </w:tcPr>
           <w:p>
+            <w:pPr>
+              <w:autoSpaceDN w:val="0"/>
+              <w:autoSpaceDE w:val="0"/>
+              <w:widowControl/>
+              <w:spacing w:line="197" w:lineRule="auto" w:before="166" w:after="0"/>
+              <w:ind w:left="100" w:right="0" w:firstLine="0"/>
+              <w:jc w:val="left"/>
+            </w:pPr>
             <w:r>
               <w:rPr>
+                <w:rFonts w:ascii="Calibri" w:hAnsi="Calibri" w:eastAsia="Calibri"/>
+                <w:b/>
+                <w:i w:val="0"/>
+                <w:color w:val="000000"/>
                 <w:sz w:val="20"/>
               </w:rPr>
-              <w:t>{{ '☑' if accommodation else '☐' }} Accommodation Provided</w:t>
-            </w:r>
-          </w:p>
-        </w:tc>
-      </w:tr>
-      <w:tr>
-        <w:tc>
-          <w:tcPr>
-            <w:tcW w:type="dxa" w:w="4320"/>
-          </w:tcPr>
-          <w:p>
-            <w:r>
-              <w:t>Food Provided / توفير الطعام</w:t>
+              <w:t xml:space="preserve">Accommodation </w:t>
             </w:r>
           </w:p>
         </w:tc>
         <w:tc>
           <w:tcPr>
-            <w:tcW w:type="dxa" w:w="4320"/>
+            <w:tcW w:type="dxa" w:w="1442"/>
+            <w:tcBorders>
+              <w:start w:sz="4.0" w:val="single" w:color="#000000"/>
+              <w:top w:sz="3.199999999999818" w:val="single" w:color="#000000"/>
+              <w:end w:sz="4.0" w:val="single" w:color="#000000"/>
+              <w:bottom w:sz="4.0" w:val="single" w:color="#000000"/>
+            </w:tcBorders>
+            <w:tcMar>
+              <w:start w:w="0" w:type="dxa"/>
+              <w:end w:w="0" w:type="dxa"/>
+            </w:tcMar>
           </w:tcPr>
           <w:p>
+            <w:pPr>
+              <w:autoSpaceDN w:val="0"/>
+              <w:autoSpaceDE w:val="0"/>
+              <w:widowControl/>
+              <w:spacing w:line="245" w:lineRule="auto" w:before="26" w:after="0"/>
+              <w:ind w:left="102" w:right="720" w:firstLine="0"/>
+              <w:jc w:val="left"/>
+            </w:pPr>
             <w:r>
               <w:rPr>
+                <w:rFonts w:ascii="Arial" w:hAnsi="Arial" w:eastAsia="Wingdings 2"/>
+                <w:b w:val="0"/>
+                <w:i w:val="0"/>
+                <w:color w:val="000000"/>
                 <w:sz w:val="20"/>
               </w:rPr>
-              <w:t>{{ '☑' if food else '☐' }} Food Provided</w:t>
+              <w:t>{{ '☑' if accommodation else '☐' }}</w:t>
             </w:r>
+            <w:r>
+              <w:rPr>
+                <w:rFonts w:ascii="Calibri" w:hAnsi="Calibri" w:eastAsia="Calibri"/>
+                <w:b w:val="0"/>
+                <w:i w:val="0"/>
+                <w:color w:val="000000"/>
+                <w:sz w:val="20"/>
+              </w:rPr>
+              <w:t>Yes</w:t>
+            </w:r>
+            <w:r>
+              <w:br/>
+            </w:r>
+            <w:r>
+              <w:rPr>
+                <w:rFonts w:ascii="Arial" w:hAnsi="Arial" w:eastAsia="Wingdings 2"/>
+                <w:b w:val="0"/>
+                <w:i w:val="0"/>
+                <w:color w:val="000000"/>
+                <w:sz w:val="20"/>
+              </w:rPr>
+              <w:t>{{ '☐' if accommodation else '☑' }}</w:t>
+            </w:r>
+            <w:r>
+              <w:rPr>
+                <w:rFonts w:ascii="Calibri" w:hAnsi="Calibri" w:eastAsia="Calibri"/>
+                <w:b w:val="0"/>
+                <w:i w:val="0"/>
+                <w:color w:val="000000"/>
+                <w:sz w:val="20"/>
+              </w:rPr>
+              <w:t xml:space="preserve">No </w:t>
+            </w:r>
+            <w:r/>
+          </w:p>
+        </w:tc>
+        <w:tc>
+          <w:tcPr>
+            <w:tcW w:type="dxa" w:w="1080"/>
+            <w:tcBorders>
+              <w:start w:sz="4.0" w:val="single" w:color="#000000"/>
+              <w:top w:sz="3.199999999999818" w:val="single" w:color="#000000"/>
+              <w:end w:sz="4.0" w:val="single" w:color="#000000"/>
+              <w:bottom w:sz="4.0" w:val="single" w:color="#000000"/>
+            </w:tcBorders>
+            <w:shd w:fill="f1f2f1"/>
+            <w:tcMar>
+              <w:start w:w="0" w:type="dxa"/>
+              <w:end w:w="0" w:type="dxa"/>
+            </w:tcMar>
+          </w:tcPr>
+          <w:p>
+            <w:pPr>
+              <w:autoSpaceDN w:val="0"/>
+              <w:autoSpaceDE w:val="0"/>
+              <w:widowControl/>
+              <w:spacing w:line="124" w:lineRule="exact" w:before="0" w:after="0"/>
+              <w:ind w:left="0" w:right="0"/>
+            </w:pPr>
+          </w:p>
+          <w:tbl>
+            <w:tblPr>
+              <w:tblW w:type="auto" w:w="0"/>
+              <w:tblLayout w:type="fixed"/>
+              <w:tblLook w:firstColumn="1" w:firstRow="1" w:lastColumn="0" w:lastRow="0" w:noHBand="0" w:noVBand="1" w:val="04A0"/>
+              <w:tblInd w:w="102.00000000000045" w:type="dxa"/>
+            </w:tblPr>
+            <w:tblGrid>
+              <w:gridCol w:w="1080"/>
+            </w:tblGrid>
+            <w:tr>
+              <w:trPr>
+                <w:trHeight w:hRule="exact" w:val="224"/>
+              </w:trPr>
+              <w:tc>
+                <w:tcPr>
+                  <w:tcW w:type="dxa" w:w="864"/>
+                  <w:tcBorders/>
+                  <w:shd w:fill="f1f2f1"/>
+                  <w:tcMar>
+                    <w:start w:w="0" w:type="dxa"/>
+                    <w:end w:w="0" w:type="dxa"/>
+                  </w:tcMar>
+                </w:tcPr>
+                <w:p>
+                  <w:pPr>
+                    <w:autoSpaceDN w:val="0"/>
+                    <w:autoSpaceDE w:val="0"/>
+                    <w:widowControl/>
+                    <w:spacing w:line="197" w:lineRule="auto" w:before="42" w:after="0"/>
+                    <w:ind w:left="0" w:right="0" w:firstLine="0"/>
+                    <w:jc w:val="left"/>
+                  </w:pPr>
+                  <w:r>
+                    <w:rPr>
+                      <w:rFonts w:ascii="Calibri" w:hAnsi="Calibri" w:eastAsia="Calibri"/>
+                      <w:b/>
+                      <w:i w:val="0"/>
+                      <w:color w:val="000000"/>
+                      <w:sz w:val="20"/>
+                    </w:rPr>
+                    <w:t xml:space="preserve">Food </w:t>
+                  </w:r>
+                </w:p>
+              </w:tc>
+            </w:tr>
+          </w:tbl>
+          <w:p>
+            <w:pPr>
+              <w:autoSpaceDN w:val="0"/>
+              <w:autoSpaceDE w:val="0"/>
+              <w:widowControl/>
+              <w:spacing w:line="14" w:lineRule="exact" w:before="0" w:after="0"/>
+              <w:ind w:left="0" w:right="0"/>
+            </w:pPr>
+          </w:p>
+        </w:tc>
+        <w:tc>
+          <w:tcPr>
+            <w:tcW w:type="dxa" w:w="1440"/>
+            <w:tcBorders>
+              <w:start w:sz="4.0" w:val="single" w:color="#000000"/>
+              <w:top w:sz="3.199999999999818" w:val="single" w:color="#000000"/>
+              <w:end w:sz="4.0" w:val="single" w:color="#000000"/>
+              <w:bottom w:sz="4.0" w:val="single" w:color="#000000"/>
+            </w:tcBorders>
+            <w:tcMar>
+              <w:start w:w="0" w:type="dxa"/>
+              <w:end w:w="0" w:type="dxa"/>
+            </w:tcMar>
+          </w:tcPr>
+          <w:p>
+            <w:pPr>
+              <w:autoSpaceDN w:val="0"/>
+              <w:autoSpaceDE w:val="0"/>
+              <w:widowControl/>
+              <w:spacing w:line="245" w:lineRule="auto" w:before="26" w:after="0"/>
+              <w:ind w:left="102" w:right="720" w:firstLine="0"/>
+              <w:jc w:val="left"/>
+            </w:pPr>
+            <w:r>
+              <w:rPr>
+                <w:rFonts w:ascii="Arial" w:hAnsi="Arial" w:eastAsia="Wingdings 2"/>
+                <w:b w:val="0"/>
+                <w:i w:val="0"/>
+                <w:color w:val="000000"/>
+                <w:sz w:val="20"/>
+              </w:rPr>
+              <w:t>{{ '☑' if food else '☐' }}</w:t>
+            </w:r>
+            <w:r>
+              <w:rPr>
+                <w:rFonts w:ascii="Calibri" w:hAnsi="Calibri" w:eastAsia="Calibri"/>
+                <w:b w:val="0"/>
+                <w:i w:val="0"/>
+                <w:color w:val="000000"/>
+                <w:sz w:val="20"/>
+              </w:rPr>
+              <w:t>Yes</w:t>
+            </w:r>
+            <w:r>
+              <w:br/>
+            </w:r>
+            <w:r>
+              <w:rPr>
+                <w:rFonts w:ascii="Arial" w:hAnsi="Arial" w:eastAsia="Wingdings 2"/>
+                <w:b w:val="0"/>
+                <w:i w:val="0"/>
+                <w:color w:val="000000"/>
+                <w:sz w:val="20"/>
+              </w:rPr>
+              <w:t>{{ '☐' if food else '☑' }}</w:t>
+            </w:r>
+            <w:r>
+              <w:rPr>
+                <w:rFonts w:ascii="Calibri" w:hAnsi="Calibri" w:eastAsia="Calibri"/>
+                <w:b w:val="0"/>
+                <w:i w:val="0"/>
+                <w:color w:val="000000"/>
+                <w:sz w:val="20"/>
+              </w:rPr>
+              <w:t xml:space="preserve">No </w:t>
+            </w:r>
+            <w:r/>
           </w:p>
         </w:tc>
       </w:tr>
       <w:tr>
+        <w:trPr>
+          <w:trHeight w:hRule="exact" w:val="500"/>
+        </w:trPr>
         <w:tc>
           <w:tcPr>
-            <w:tcW w:type="dxa" w:w="4320"/>
+            <w:tcW w:type="dxa" w:w="2868"/>
+            <w:tcBorders>
+              <w:start w:sz="3.1999999999999886" w:val="single" w:color="#000000"/>
+              <w:top w:sz="4.0" w:val="single" w:color="#000000"/>
+              <w:end w:sz="4.0" w:val="single" w:color="#000000"/>
+              <w:bottom w:sz="4.0" w:val="single" w:color="#000000"/>
+            </w:tcBorders>
+            <w:shd w:fill="f1f2f1"/>
+            <w:tcMar>
+              <w:start w:w="0" w:type="dxa"/>
+              <w:end w:w="0" w:type="dxa"/>
+            </w:tcMar>
           </w:tcPr>
           <w:p>
+            <w:pPr>
+              <w:autoSpaceDN w:val="0"/>
+              <w:autoSpaceDE w:val="0"/>
+              <w:widowControl/>
+              <w:spacing w:line="245" w:lineRule="auto" w:before="42" w:after="0"/>
+              <w:ind w:left="104" w:right="288" w:firstLine="0"/>
+              <w:jc w:val="left"/>
+            </w:pPr>
             <w:r>
-              <w:t>Additional Job Information (Mental / Physical Demands) / معلومات وظيفية إضافية</w:t>
+              <w:rPr>
+                <w:rFonts w:ascii="Calibri" w:hAnsi="Calibri" w:eastAsia="Calibri"/>
+                <w:b/>
+                <w:i w:val="0"/>
+                <w:color w:val="000000"/>
+                <w:sz w:val="20"/>
+              </w:rPr>
+              <w:t xml:space="preserve">Additional Job Information </w:t>
+            </w:r>
+            <w:r>
+              <w:rPr>
+                <w:rFonts w:ascii="Calibri" w:hAnsi="Calibri" w:eastAsia="Calibri"/>
+                <w:b w:val="0"/>
+                <w:i w:val="0"/>
+                <w:color w:val="000000"/>
+                <w:sz w:val="20"/>
+              </w:rPr>
+              <w:t xml:space="preserve">(Mental / Physical Demands) </w:t>
             </w:r>
           </w:p>
         </w:tc>
         <w:tc>
           <w:tcPr>
-            <w:tcW w:type="dxa" w:w="4320"/>
+            <w:tcW w:type="dxa" w:w="7660"/>
+            <w:gridSpan w:val="6"/>
+            <w:tcBorders>
+              <w:start w:sz="4.0" w:val="single" w:color="#000000"/>
+              <w:top w:sz="4.0" w:val="single" w:color="#000000"/>
+              <w:end w:sz="4.0" w:val="single" w:color="#000000"/>
+              <w:bottom w:sz="4.0" w:val="single" w:color="#000000"/>
+            </w:tcBorders>
+            <w:tcMar>
+              <w:start w:w="0" w:type="dxa"/>
+              <w:end w:w="0" w:type="dxa"/>
+            </w:tcMar>
+            <w:tcMar>
+              <w:start w:w="0" w:type="dxa"/>
+              <w:end w:w="0" w:type="dxa"/>
+            </w:tcMar>
+            <w:tcMar>
+              <w:start w:w="0" w:type="dxa"/>
+              <w:end w:w="0" w:type="dxa"/>
+            </w:tcMar>
+            <w:tcMar>
+              <w:start w:w="0" w:type="dxa"/>
+              <w:end w:w="0" w:type="dxa"/>
+            </w:tcMar>
+            <w:tcMar>
+              <w:start w:w="0" w:type="dxa"/>
+              <w:end w:w="0" w:type="dxa"/>
+            </w:tcMar>
+            <w:tcMar>
+              <w:start w:w="0" w:type="dxa"/>
+              <w:end w:w="0" w:type="dxa"/>
+            </w:tcMar>
           </w:tcPr>
           <w:p>
             <w:r>
-              <w:rPr>
-                <w:sz w:val="20"/>
-              </w:rPr>
               <w:t>{{ additional_info }}</w:t>
             </w:r>
           </w:p>
         </w:tc>
       </w:tr>
     </w:tbl>
-    <w:p/>
+    <w:p>
+      <w:pPr>
+        <w:autoSpaceDN w:val="0"/>
+        <w:autoSpaceDE w:val="0"/>
+        <w:widowControl/>
+        <w:spacing w:line="242" w:lineRule="exact" w:before="0" w:after="0"/>
+        <w:ind w:left="0" w:right="0"/>
+      </w:pPr>
+    </w:p>
     <w:tbl>
       <w:tblPr>
-        <w:tblStyle w:val="TableGrid"/>
         <w:tblW w:type="auto" w:w="0"/>
+        <w:tblLayout w:type="fixed"/>
         <w:tblLook w:firstColumn="1" w:firstRow="1" w:lastColumn="0" w:lastRow="0" w:noHBand="0" w:noVBand="1" w:val="04A0"/>
+        <w:tblInd w:w="816.0" w:type="dxa"/>
       </w:tblPr>
       <w:tblGrid>
-        <w:gridCol w:w="4320"/>
-        <w:gridCol w:w="4320"/>
+        <w:gridCol w:w="2256"/>
+        <w:gridCol w:w="2256"/>
+        <w:gridCol w:w="2256"/>
+        <w:gridCol w:w="2256"/>
       </w:tblGrid>
       <w:tr>
+        <w:trPr>
+          <w:trHeight w:hRule="exact" w:val="412"/>
+        </w:trPr>
         <w:tc>
           <w:tcPr>
-            <w:tcW w:type="dxa" w:w="4320"/>
+            <w:tcW w:type="dxa" w:w="10528"/>
+            <w:gridSpan w:val="4"/>
+            <w:tcBorders>
+              <w:start w:sz="3.1999999999999886" w:val="single" w:color="#000000"/>
+              <w:top w:sz="4.0" w:val="single" w:color="#000000"/>
+              <w:end w:sz="4.0" w:val="single" w:color="#000000"/>
+              <w:bottom w:sz="4.0" w:val="single" w:color="#000000"/>
+            </w:tcBorders>
+            <w:shd w:fill="c00000"/>
+            <w:tcMar>
+              <w:start w:w="0" w:type="dxa"/>
+              <w:end w:w="0" w:type="dxa"/>
+            </w:tcMar>
+            <w:tcMar>
+              <w:start w:w="0" w:type="dxa"/>
+              <w:end w:w="0" w:type="dxa"/>
+            </w:tcMar>
+            <w:tcMar>
+              <w:start w:w="0" w:type="dxa"/>
+              <w:end w:w="0" w:type="dxa"/>
+            </w:tcMar>
+            <w:tcMar>
+              <w:start w:w="0" w:type="dxa"/>
+              <w:end w:w="0" w:type="dxa"/>
+            </w:tcMar>
           </w:tcPr>
           <w:p>
+            <w:pPr>
+              <w:autoSpaceDN w:val="0"/>
+              <w:autoSpaceDE w:val="0"/>
+              <w:widowControl/>
+              <w:spacing w:line="230" w:lineRule="auto" w:before="76" w:after="0"/>
+              <w:ind w:left="0" w:right="0" w:firstLine="0"/>
+              <w:jc w:val="center"/>
+            </w:pPr>
             <w:r>
-              <w:t>Line Manager / المدير المباشر</w:t>
+              <w:rPr>
+                <w:rFonts w:ascii="Univers" w:hAnsi="Univers" w:eastAsia="Univers"/>
+                <w:b/>
+                <w:i w:val="0"/>
+                <w:color w:val="FFFFFF"/>
+                <w:sz w:val="20"/>
+              </w:rPr>
+              <w:t>Authorization</w:t>
+            </w:r>
+          </w:p>
+        </w:tc>
+      </w:tr>
+      <w:tr>
+        <w:trPr>
+          <w:trHeight w:hRule="exact" w:val="406"/>
+        </w:trPr>
+        <w:tc>
+          <w:tcPr>
+            <w:tcW w:type="dxa" w:w="2614"/>
+            <w:tcBorders>
+              <w:start w:sz="3.1999999999999886" w:val="single" w:color="#000000"/>
+              <w:top w:sz="4.0" w:val="single" w:color="#000000"/>
+              <w:end w:sz="3.199999999999818" w:val="single" w:color="#000000"/>
+              <w:bottom w:sz="4.0" w:val="single" w:color="#000000"/>
+            </w:tcBorders>
+            <w:shd w:fill="f1f2f1"/>
+            <w:tcMar>
+              <w:start w:w="0" w:type="dxa"/>
+              <w:end w:w="0" w:type="dxa"/>
+            </w:tcMar>
+          </w:tcPr>
+          <w:p/>
+        </w:tc>
+        <w:tc>
+          <w:tcPr>
+            <w:tcW w:type="dxa" w:w="2614"/>
+            <w:tcBorders>
+              <w:start w:sz="3.199999999999818" w:val="single" w:color="#000000"/>
+              <w:top w:sz="4.0" w:val="single" w:color="#000000"/>
+              <w:end w:sz="3.199999999999818" w:val="single" w:color="#000000"/>
+              <w:bottom w:sz="4.0" w:val="single" w:color="#000000"/>
+            </w:tcBorders>
+            <w:shd w:fill="f1f2f1"/>
+            <w:tcMar>
+              <w:start w:w="0" w:type="dxa"/>
+              <w:end w:w="0" w:type="dxa"/>
+            </w:tcMar>
+          </w:tcPr>
+          <w:p>
+            <w:pPr>
+              <w:autoSpaceDN w:val="0"/>
+              <w:autoSpaceDE w:val="0"/>
+              <w:widowControl/>
+              <w:spacing w:line="194" w:lineRule="auto" w:before="120" w:after="0"/>
+              <w:ind w:left="0" w:right="0" w:firstLine="0"/>
+              <w:jc w:val="center"/>
+            </w:pPr>
+            <w:r>
+              <w:rPr>
+                <w:rFonts w:ascii="Calibri" w:hAnsi="Calibri" w:eastAsia="Calibri"/>
+                <w:b/>
+                <w:i w:val="0"/>
+                <w:color w:val="000000"/>
+                <w:sz w:val="20"/>
+              </w:rPr>
+              <w:t xml:space="preserve">Signature </w:t>
             </w:r>
           </w:p>
         </w:tc>
         <w:tc>
           <w:tcPr>
-            <w:tcW w:type="dxa" w:w="4320"/>
+            <w:tcW w:type="dxa" w:w="2612"/>
+            <w:tcBorders>
+              <w:start w:sz="3.199999999999818" w:val="single" w:color="#000000"/>
+              <w:top w:sz="4.0" w:val="single" w:color="#000000"/>
+              <w:end w:sz="3.199999999999818" w:val="single" w:color="#000000"/>
+              <w:bottom w:sz="4.0" w:val="single" w:color="#000000"/>
+            </w:tcBorders>
+            <w:shd w:fill="f1f2f1"/>
+            <w:tcMar>
+              <w:start w:w="0" w:type="dxa"/>
+              <w:end w:w="0" w:type="dxa"/>
+            </w:tcMar>
+          </w:tcPr>
+          <w:p>
+            <w:pPr>
+              <w:autoSpaceDN w:val="0"/>
+              <w:autoSpaceDE w:val="0"/>
+              <w:widowControl/>
+              <w:spacing w:line="194" w:lineRule="auto" w:before="120" w:after="0"/>
+              <w:ind w:left="0" w:right="0" w:firstLine="0"/>
+              <w:jc w:val="center"/>
+            </w:pPr>
+            <w:r>
+              <w:rPr>
+                <w:rFonts w:ascii="Calibri" w:hAnsi="Calibri" w:eastAsia="Calibri"/>
+                <w:b/>
+                <w:i w:val="0"/>
+                <w:color w:val="000000"/>
+                <w:sz w:val="20"/>
+              </w:rPr>
+              <w:t xml:space="preserve">Date </w:t>
+            </w:r>
+          </w:p>
+        </w:tc>
+        <w:tc>
+          <w:tcPr>
+            <w:tcW w:type="dxa" w:w="2688"/>
+            <w:tcBorders>
+              <w:start w:sz="3.199999999999818" w:val="single" w:color="#000000"/>
+              <w:top w:sz="4.0" w:val="single" w:color="#000000"/>
+              <w:end w:sz="4.0" w:val="single" w:color="#000000"/>
+              <w:bottom w:sz="4.0" w:val="single" w:color="#000000"/>
+            </w:tcBorders>
+            <w:shd w:fill="f1f2f1"/>
+            <w:tcMar>
+              <w:start w:w="0" w:type="dxa"/>
+              <w:end w:w="0" w:type="dxa"/>
+            </w:tcMar>
+          </w:tcPr>
+          <w:p>
+            <w:pPr>
+              <w:autoSpaceDN w:val="0"/>
+              <w:autoSpaceDE w:val="0"/>
+              <w:widowControl/>
+              <w:spacing w:line="194" w:lineRule="auto" w:before="120" w:after="0"/>
+              <w:ind w:left="0" w:right="0" w:firstLine="0"/>
+              <w:jc w:val="center"/>
+            </w:pPr>
+            <w:r>
+              <w:rPr>
+                <w:rFonts w:ascii="Calibri" w:hAnsi="Calibri" w:eastAsia="Calibri"/>
+                <w:b/>
+                <w:i w:val="0"/>
+                <w:color w:val="000000"/>
+                <w:sz w:val="20"/>
+              </w:rPr>
+              <w:t xml:space="preserve">Comments (if any) </w:t>
+            </w:r>
+          </w:p>
+        </w:tc>
+      </w:tr>
+      <w:tr>
+        <w:trPr>
+          <w:trHeight w:hRule="exact" w:val="412"/>
+        </w:trPr>
+        <w:tc>
+          <w:tcPr>
+            <w:tcW w:type="dxa" w:w="2614"/>
+            <w:tcBorders>
+              <w:start w:sz="3.1999999999999886" w:val="single" w:color="#000000"/>
+              <w:top w:sz="4.0" w:val="single" w:color="#000000"/>
+              <w:end w:sz="3.199999999999818" w:val="single" w:color="#000000"/>
+              <w:bottom w:sz="3.199999999999818" w:val="single" w:color="#000000"/>
+            </w:tcBorders>
+            <w:shd w:fill="f1f2f1"/>
+            <w:tcMar>
+              <w:start w:w="0" w:type="dxa"/>
+              <w:end w:w="0" w:type="dxa"/>
+            </w:tcMar>
+          </w:tcPr>
+          <w:p>
+            <w:pPr>
+              <w:autoSpaceDN w:val="0"/>
+              <w:autoSpaceDE w:val="0"/>
+              <w:widowControl/>
+              <w:spacing w:line="194" w:lineRule="auto" w:before="120" w:after="0"/>
+              <w:ind w:left="104" w:right="0" w:firstLine="0"/>
+              <w:jc w:val="left"/>
+            </w:pPr>
+            <w:r>
+              <w:rPr>
+                <w:rFonts w:ascii="Calibri" w:hAnsi="Calibri" w:eastAsia="Calibri"/>
+                <w:b/>
+                <w:i w:val="0"/>
+                <w:color w:val="000000"/>
+                <w:sz w:val="20"/>
+              </w:rPr>
+              <w:t xml:space="preserve">Department Manager </w:t>
+            </w:r>
+          </w:p>
+        </w:tc>
+        <w:tc>
+          <w:tcPr>
+            <w:tcW w:type="dxa" w:w="2614"/>
+            <w:tcBorders>
+              <w:start w:sz="3.199999999999818" w:val="single" w:color="#000000"/>
+              <w:top w:sz="4.0" w:val="single" w:color="#000000"/>
+              <w:end w:sz="3.199999999999818" w:val="single" w:color="#000000"/>
+              <w:bottom w:sz="3.199999999999818" w:val="single" w:color="#000000"/>
+            </w:tcBorders>
+            <w:tcMar>
+              <w:start w:w="0" w:type="dxa"/>
+              <w:end w:w="0" w:type="dxa"/>
+            </w:tcMar>
           </w:tcPr>
           <w:p>
             <w:r>
+              <w:t>{{ manager_sig }}</w:t>
+            </w:r>
+          </w:p>
+        </w:tc>
+        <w:tc>
+          <w:tcPr>
+            <w:tcW w:type="dxa" w:w="2612"/>
+            <w:tcBorders>
+              <w:start w:sz="3.199999999999818" w:val="single" w:color="#000000"/>
+              <w:top w:sz="4.0" w:val="single" w:color="#000000"/>
+              <w:end w:sz="3.199999999999818" w:val="single" w:color="#000000"/>
+              <w:bottom w:sz="3.199999999999818" w:val="single" w:color="#000000"/>
+            </w:tcBorders>
+            <w:tcMar>
+              <w:start w:w="0" w:type="dxa"/>
+              <w:end w:w="0" w:type="dxa"/>
+            </w:tcMar>
+          </w:tcPr>
+          <w:p/>
+        </w:tc>
+        <w:tc>
+          <w:tcPr>
+            <w:tcW w:type="dxa" w:w="2688"/>
+            <w:tcBorders>
+              <w:start w:sz="3.199999999999818" w:val="single" w:color="#000000"/>
+              <w:top w:sz="4.0" w:val="single" w:color="#000000"/>
+              <w:end w:sz="4.0" w:val="single" w:color="#000000"/>
+              <w:bottom w:sz="3.199999999999818" w:val="single" w:color="#000000"/>
+            </w:tcBorders>
+            <w:tcMar>
+              <w:start w:w="0" w:type="dxa"/>
+              <w:end w:w="0" w:type="dxa"/>
+            </w:tcMar>
+          </w:tcPr>
+          <w:p>
+            <w:r>
+              <w:t>{{ manager_name }}</w:t>
+            </w:r>
+          </w:p>
+        </w:tc>
+      </w:tr>
+      <w:tr>
+        <w:trPr>
+          <w:trHeight w:hRule="exact" w:val="408"/>
+        </w:trPr>
+        <w:tc>
+          <w:tcPr>
+            <w:tcW w:type="dxa" w:w="2614"/>
+            <w:tcBorders>
+              <w:start w:sz="3.1999999999999886" w:val="single" w:color="#000000"/>
+              <w:top w:sz="3.199999999999818" w:val="single" w:color="#000000"/>
+              <w:end w:sz="3.199999999999818" w:val="single" w:color="#000000"/>
+              <w:bottom w:sz="3.199999999999818" w:val="single" w:color="#000000"/>
+            </w:tcBorders>
+            <w:shd w:fill="f1f2f1"/>
+            <w:tcMar>
+              <w:start w:w="0" w:type="dxa"/>
+              <w:end w:w="0" w:type="dxa"/>
+            </w:tcMar>
+          </w:tcPr>
+          <w:p>
+            <w:pPr>
+              <w:autoSpaceDN w:val="0"/>
+              <w:autoSpaceDE w:val="0"/>
+              <w:widowControl/>
+              <w:spacing w:line="197" w:lineRule="auto" w:before="120" w:after="0"/>
+              <w:ind w:left="104" w:right="0" w:firstLine="0"/>
+              <w:jc w:val="left"/>
+            </w:pPr>
+            <w:r>
               <w:rPr>
+                <w:rFonts w:ascii="Calibri" w:hAnsi="Calibri" w:eastAsia="Calibri"/>
+                <w:b/>
+                <w:i w:val="0"/>
+                <w:color w:val="000000"/>
                 <w:sz w:val="20"/>
               </w:rPr>
-              <w:t>{{ manager_name }}  {{ manager_sig }}</w:t>
+              <w:t xml:space="preserve">MD </w:t>
+            </w:r>
+          </w:p>
+        </w:tc>
+        <w:tc>
+          <w:tcPr>
+            <w:tcW w:type="dxa" w:w="2614"/>
+            <w:tcBorders>
+              <w:start w:sz="3.199999999999818" w:val="single" w:color="#000000"/>
+              <w:top w:sz="3.199999999999818" w:val="single" w:color="#000000"/>
+              <w:end w:sz="3.199999999999818" w:val="single" w:color="#000000"/>
+              <w:bottom w:sz="3.199999999999818" w:val="single" w:color="#000000"/>
+            </w:tcBorders>
+            <w:tcMar>
+              <w:start w:w="0" w:type="dxa"/>
+              <w:end w:w="0" w:type="dxa"/>
+            </w:tcMar>
+          </w:tcPr>
+          <w:p/>
+        </w:tc>
+        <w:tc>
+          <w:tcPr>
+            <w:tcW w:type="dxa" w:w="2612"/>
+            <w:tcBorders>
+              <w:start w:sz="3.199999999999818" w:val="single" w:color="#000000"/>
+              <w:top w:sz="3.199999999999818" w:val="single" w:color="#000000"/>
+              <w:end w:sz="3.199999999999818" w:val="single" w:color="#000000"/>
+              <w:bottom w:sz="3.199999999999818" w:val="single" w:color="#000000"/>
+            </w:tcBorders>
+            <w:tcMar>
+              <w:start w:w="0" w:type="dxa"/>
+              <w:end w:w="0" w:type="dxa"/>
+            </w:tcMar>
+          </w:tcPr>
+          <w:p/>
+        </w:tc>
+        <w:tc>
+          <w:tcPr>
+            <w:tcW w:type="dxa" w:w="2688"/>
+            <w:tcBorders>
+              <w:start w:sz="3.199999999999818" w:val="single" w:color="#000000"/>
+              <w:top w:sz="3.199999999999818" w:val="single" w:color="#000000"/>
+              <w:end w:sz="4.0" w:val="single" w:color="#000000"/>
+              <w:bottom w:sz="3.199999999999818" w:val="single" w:color="#000000"/>
+            </w:tcBorders>
+            <w:tcMar>
+              <w:start w:w="0" w:type="dxa"/>
+              <w:end w:w="0" w:type="dxa"/>
+            </w:tcMar>
+          </w:tcPr>
+          <w:p/>
+        </w:tc>
+      </w:tr>
+      <w:tr>
+        <w:trPr>
+          <w:trHeight w:hRule="exact" w:val="408"/>
+        </w:trPr>
+        <w:tc>
+          <w:tcPr>
+            <w:tcW w:type="dxa" w:w="2614"/>
+            <w:tcBorders>
+              <w:start w:sz="3.1999999999999886" w:val="single" w:color="#000000"/>
+              <w:top w:sz="3.199999999999818" w:val="single" w:color="#000000"/>
+              <w:end w:sz="3.199999999999818" w:val="single" w:color="#000000"/>
+              <w:bottom w:sz="3.2000000000007276" w:val="single" w:color="#000000"/>
+            </w:tcBorders>
+            <w:shd w:fill="f1f2f1"/>
+            <w:tcMar>
+              <w:start w:w="0" w:type="dxa"/>
+              <w:end w:w="0" w:type="dxa"/>
+            </w:tcMar>
+          </w:tcPr>
+          <w:p>
+            <w:pPr>
+              <w:autoSpaceDN w:val="0"/>
+              <w:autoSpaceDE w:val="0"/>
+              <w:widowControl/>
+              <w:spacing w:line="197" w:lineRule="auto" w:before="120" w:after="0"/>
+              <w:ind w:left="104" w:right="0" w:firstLine="0"/>
+              <w:jc w:val="left"/>
+            </w:pPr>
+            <w:r>
+              <w:rPr>
+                <w:rFonts w:ascii="Calibri" w:hAnsi="Calibri" w:eastAsia="Calibri"/>
+                <w:b/>
+                <w:i w:val="0"/>
+                <w:color w:val="000000"/>
+                <w:sz w:val="20"/>
+              </w:rPr>
+              <w:t xml:space="preserve">CEO </w:t>
+            </w:r>
+          </w:p>
+        </w:tc>
+        <w:tc>
+          <w:tcPr>
+            <w:tcW w:type="dxa" w:w="2614"/>
+            <w:tcBorders>
+              <w:start w:sz="3.199999999999818" w:val="single" w:color="#000000"/>
+              <w:top w:sz="3.199999999999818" w:val="single" w:color="#000000"/>
+              <w:end w:sz="3.199999999999818" w:val="single" w:color="#000000"/>
+              <w:bottom w:sz="3.2000000000007276" w:val="single" w:color="#000000"/>
+            </w:tcBorders>
+            <w:tcMar>
+              <w:start w:w="0" w:type="dxa"/>
+              <w:end w:w="0" w:type="dxa"/>
+            </w:tcMar>
+          </w:tcPr>
+          <w:p/>
+        </w:tc>
+        <w:tc>
+          <w:tcPr>
+            <w:tcW w:type="dxa" w:w="2612"/>
+            <w:tcBorders>
+              <w:start w:sz="3.199999999999818" w:val="single" w:color="#000000"/>
+              <w:top w:sz="3.199999999999818" w:val="single" w:color="#000000"/>
+              <w:end w:sz="3.199999999999818" w:val="single" w:color="#000000"/>
+              <w:bottom w:sz="3.2000000000007276" w:val="single" w:color="#000000"/>
+            </w:tcBorders>
+            <w:tcMar>
+              <w:start w:w="0" w:type="dxa"/>
+              <w:end w:w="0" w:type="dxa"/>
+            </w:tcMar>
+          </w:tcPr>
+          <w:p/>
+        </w:tc>
+        <w:tc>
+          <w:tcPr>
+            <w:tcW w:type="dxa" w:w="2688"/>
+            <w:tcBorders>
+              <w:start w:sz="3.199999999999818" w:val="single" w:color="#000000"/>
+              <w:top w:sz="3.199999999999818" w:val="single" w:color="#000000"/>
+              <w:end w:sz="4.0" w:val="single" w:color="#000000"/>
+              <w:bottom w:sz="3.2000000000007276" w:val="single" w:color="#000000"/>
+            </w:tcBorders>
+            <w:tcMar>
+              <w:start w:w="0" w:type="dxa"/>
+              <w:end w:w="0" w:type="dxa"/>
+            </w:tcMar>
+          </w:tcPr>
+          <w:p/>
+        </w:tc>
+      </w:tr>
+      <w:tr>
+        <w:trPr>
+          <w:trHeight w:hRule="exact" w:val="410"/>
+        </w:trPr>
+        <w:tc>
+          <w:tcPr>
+            <w:tcW w:type="dxa" w:w="2614"/>
+            <w:tcBorders>
+              <w:start w:sz="3.1999999999999886" w:val="single" w:color="#000000"/>
+              <w:top w:sz="3.2000000000007276" w:val="single" w:color="#000000"/>
+              <w:end w:sz="3.199999999999818" w:val="single" w:color="#000000"/>
+              <w:bottom w:sz="4.0" w:val="single" w:color="#000000"/>
+            </w:tcBorders>
+            <w:shd w:fill="f1f2f1"/>
+            <w:tcMar>
+              <w:start w:w="0" w:type="dxa"/>
+              <w:end w:w="0" w:type="dxa"/>
+            </w:tcMar>
+          </w:tcPr>
+          <w:p>
+            <w:pPr>
+              <w:autoSpaceDN w:val="0"/>
+              <w:autoSpaceDE w:val="0"/>
+              <w:widowControl/>
+              <w:spacing w:line="197" w:lineRule="auto" w:before="120" w:after="0"/>
+              <w:ind w:left="104" w:right="0" w:firstLine="0"/>
+              <w:jc w:val="left"/>
+            </w:pPr>
+            <w:r>
+              <w:rPr>
+                <w:rFonts w:ascii="Calibri" w:hAnsi="Calibri" w:eastAsia="Calibri"/>
+                <w:b/>
+                <w:i w:val="0"/>
+                <w:color w:val="000000"/>
+                <w:sz w:val="20"/>
+              </w:rPr>
+              <w:t xml:space="preserve">HR Manager </w:t>
+            </w:r>
+          </w:p>
+        </w:tc>
+        <w:tc>
+          <w:tcPr>
+            <w:tcW w:type="dxa" w:w="2614"/>
+            <w:tcBorders>
+              <w:start w:sz="3.199999999999818" w:val="single" w:color="#000000"/>
+              <w:top w:sz="3.2000000000007276" w:val="single" w:color="#000000"/>
+              <w:end w:sz="3.199999999999818" w:val="single" w:color="#000000"/>
+              <w:bottom w:sz="4.0" w:val="single" w:color="#000000"/>
+            </w:tcBorders>
+            <w:tcMar>
+              <w:start w:w="0" w:type="dxa"/>
+              <w:end w:w="0" w:type="dxa"/>
+            </w:tcMar>
+          </w:tcPr>
+          <w:p/>
+        </w:tc>
+        <w:tc>
+          <w:tcPr>
+            <w:tcW w:type="dxa" w:w="2612"/>
+            <w:tcBorders>
+              <w:start w:sz="3.199999999999818" w:val="single" w:color="#000000"/>
+              <w:top w:sz="3.2000000000007276" w:val="single" w:color="#000000"/>
+              <w:end w:sz="3.199999999999818" w:val="single" w:color="#000000"/>
+              <w:bottom w:sz="4.0" w:val="single" w:color="#000000"/>
+            </w:tcBorders>
+            <w:tcMar>
+              <w:start w:w="0" w:type="dxa"/>
+              <w:end w:w="0" w:type="dxa"/>
+            </w:tcMar>
+          </w:tcPr>
+          <w:p/>
+        </w:tc>
+        <w:tc>
+          <w:tcPr>
+            <w:tcW w:type="dxa" w:w="2688"/>
+            <w:tcBorders>
+              <w:start w:sz="3.199999999999818" w:val="single" w:color="#000000"/>
+              <w:top w:sz="3.2000000000007276" w:val="single" w:color="#000000"/>
+              <w:end w:sz="4.0" w:val="single" w:color="#000000"/>
+              <w:bottom w:sz="4.0" w:val="single" w:color="#000000"/>
+            </w:tcBorders>
+            <w:tcMar>
+              <w:start w:w="0" w:type="dxa"/>
+              <w:end w:w="0" w:type="dxa"/>
+            </w:tcMar>
+          </w:tcPr>
+          <w:p/>
+        </w:tc>
+      </w:tr>
+    </w:tbl>
+    <w:p>
+      <w:pPr>
+        <w:autoSpaceDN w:val="0"/>
+        <w:autoSpaceDE w:val="0"/>
+        <w:widowControl/>
+        <w:spacing w:line="244" w:lineRule="exact" w:before="0" w:after="0"/>
+        <w:ind w:left="0" w:right="0"/>
+      </w:pPr>
+    </w:p>
+    <w:tbl>
+      <w:tblPr>
+        <w:tblW w:type="auto" w:w="0"/>
+        <w:tblLayout w:type="fixed"/>
+        <w:tblLook w:firstColumn="1" w:firstRow="1" w:lastColumn="0" w:lastRow="0" w:noHBand="0" w:noVBand="1" w:val="04A0"/>
+        <w:tblInd w:w="816.0" w:type="dxa"/>
+      </w:tblPr>
+      <w:tblGrid>
+        <w:gridCol w:w="2256"/>
+        <w:gridCol w:w="2256"/>
+        <w:gridCol w:w="2256"/>
+        <w:gridCol w:w="2256"/>
+      </w:tblGrid>
+      <w:tr>
+        <w:trPr>
+          <w:trHeight w:hRule="exact" w:val="274"/>
+        </w:trPr>
+        <w:tc>
+          <w:tcPr>
+            <w:tcW w:type="dxa" w:w="10528"/>
+            <w:gridSpan w:val="4"/>
+            <w:tcBorders>
+              <w:start w:sz="3.1999999999999886" w:val="single" w:color="#000000"/>
+              <w:top w:sz="4.0" w:val="single" w:color="#000000"/>
+              <w:end w:sz="4.0" w:val="single" w:color="#000000"/>
+              <w:bottom w:sz="4.0" w:val="single" w:color="#000000"/>
+            </w:tcBorders>
+            <w:shd w:fill="c00000"/>
+            <w:tcMar>
+              <w:start w:w="0" w:type="dxa"/>
+              <w:end w:w="0" w:type="dxa"/>
+            </w:tcMar>
+            <w:tcMar>
+              <w:start w:w="0" w:type="dxa"/>
+              <w:end w:w="0" w:type="dxa"/>
+            </w:tcMar>
+            <w:tcMar>
+              <w:start w:w="0" w:type="dxa"/>
+              <w:end w:w="0" w:type="dxa"/>
+            </w:tcMar>
+            <w:tcMar>
+              <w:start w:w="0" w:type="dxa"/>
+              <w:end w:w="0" w:type="dxa"/>
+            </w:tcMar>
+          </w:tcPr>
+          <w:p>
+            <w:pPr>
+              <w:autoSpaceDN w:val="0"/>
+              <w:autoSpaceDE w:val="0"/>
+              <w:widowControl/>
+              <w:spacing w:line="230" w:lineRule="auto" w:before="8" w:after="0"/>
+              <w:ind w:left="0" w:right="0" w:firstLine="0"/>
+              <w:jc w:val="center"/>
+            </w:pPr>
+            <w:r>
+              <w:rPr>
+                <w:rFonts w:ascii="Univers" w:hAnsi="Univers" w:eastAsia="Univers"/>
+                <w:b/>
+                <w:i w:val="0"/>
+                <w:color w:val="FFFFFF"/>
+                <w:sz w:val="20"/>
+              </w:rPr>
+              <w:t xml:space="preserve">Human Resources Department Use Only </w:t>
+            </w:r>
+          </w:p>
+        </w:tc>
+      </w:tr>
+      <w:tr>
+        <w:trPr>
+          <w:trHeight w:hRule="exact" w:val="428"/>
+        </w:trPr>
+        <w:tc>
+          <w:tcPr>
+            <w:tcW w:type="dxa" w:w="2614"/>
+            <w:tcBorders>
+              <w:start w:sz="3.1999999999999886" w:val="single" w:color="#000000"/>
+              <w:top w:sz="4.0" w:val="single" w:color="#000000"/>
+              <w:end w:sz="3.199999999999818" w:val="single" w:color="#000000"/>
+              <w:bottom w:sz="3.199999999999818" w:val="single" w:color="#000000"/>
+            </w:tcBorders>
+            <w:shd w:fill="f1f2f1"/>
+            <w:tcMar>
+              <w:start w:w="0" w:type="dxa"/>
+              <w:end w:w="0" w:type="dxa"/>
+            </w:tcMar>
+          </w:tcPr>
+          <w:p>
+            <w:pPr>
+              <w:autoSpaceDN w:val="0"/>
+              <w:autoSpaceDE w:val="0"/>
+              <w:widowControl/>
+              <w:spacing w:line="197" w:lineRule="auto" w:before="128" w:after="0"/>
+              <w:ind w:left="104" w:right="0" w:firstLine="0"/>
+              <w:jc w:val="left"/>
+            </w:pPr>
+            <w:r>
+              <w:rPr>
+                <w:rFonts w:ascii="Calibri" w:hAnsi="Calibri" w:eastAsia="Calibri"/>
+                <w:b/>
+                <w:i w:val="0"/>
+                <w:color w:val="000000"/>
+                <w:sz w:val="20"/>
+              </w:rPr>
+              <w:t xml:space="preserve">Position Filled By </w:t>
+            </w:r>
+          </w:p>
+        </w:tc>
+        <w:tc>
+          <w:tcPr>
+            <w:tcW w:type="dxa" w:w="2614"/>
+            <w:tcBorders>
+              <w:start w:sz="3.199999999999818" w:val="single" w:color="#000000"/>
+              <w:top w:sz="4.0" w:val="single" w:color="#000000"/>
+              <w:end w:sz="3.199999999999818" w:val="single" w:color="#000000"/>
+              <w:bottom w:sz="3.199999999999818" w:val="single" w:color="#000000"/>
+            </w:tcBorders>
+            <w:tcMar>
+              <w:start w:w="0" w:type="dxa"/>
+              <w:end w:w="0" w:type="dxa"/>
+            </w:tcMar>
+          </w:tcPr>
+          <w:p/>
+        </w:tc>
+        <w:tc>
+          <w:tcPr>
+            <w:tcW w:type="dxa" w:w="2618"/>
+            <w:tcBorders>
+              <w:start w:sz="3.199999999999818" w:val="single" w:color="#000000"/>
+              <w:top w:sz="4.0" w:val="single" w:color="#000000"/>
+              <w:end w:sz="4.0" w:val="single" w:color="#000000"/>
+              <w:bottom w:sz="3.199999999999818" w:val="single" w:color="#000000"/>
+            </w:tcBorders>
+            <w:shd w:fill="f1f2f1"/>
+            <w:tcMar>
+              <w:start w:w="0" w:type="dxa"/>
+              <w:end w:w="0" w:type="dxa"/>
+            </w:tcMar>
+          </w:tcPr>
+          <w:p>
+            <w:pPr>
+              <w:autoSpaceDN w:val="0"/>
+              <w:autoSpaceDE w:val="0"/>
+              <w:widowControl/>
+              <w:spacing w:line="197" w:lineRule="auto" w:before="128" w:after="0"/>
+              <w:ind w:left="104" w:right="0" w:firstLine="0"/>
+              <w:jc w:val="left"/>
+            </w:pPr>
+            <w:r>
+              <w:rPr>
+                <w:rFonts w:ascii="Calibri" w:hAnsi="Calibri" w:eastAsia="Calibri"/>
+                <w:b/>
+                <w:i w:val="0"/>
+                <w:color w:val="000000"/>
+                <w:sz w:val="20"/>
+              </w:rPr>
+              <w:t xml:space="preserve">Joining Date </w:t>
+            </w:r>
+          </w:p>
+        </w:tc>
+        <w:tc>
+          <w:tcPr>
+            <w:tcW w:type="dxa" w:w="2682"/>
+            <w:tcBorders>
+              <w:start w:sz="4.0" w:val="single" w:color="#000000"/>
+              <w:top w:sz="4.0" w:val="single" w:color="#000000"/>
+              <w:end w:sz="4.0" w:val="single" w:color="#000000"/>
+              <w:bottom w:sz="3.199999999999818" w:val="single" w:color="#000000"/>
+            </w:tcBorders>
+            <w:tcMar>
+              <w:start w:w="0" w:type="dxa"/>
+              <w:end w:w="0" w:type="dxa"/>
+            </w:tcMar>
+          </w:tcPr>
+          <w:p/>
+        </w:tc>
+      </w:tr>
+      <w:tr>
+        <w:trPr>
+          <w:trHeight w:hRule="exact" w:val="424"/>
+        </w:trPr>
+        <w:tc>
+          <w:tcPr>
+            <w:tcW w:type="dxa" w:w="2614"/>
+            <w:tcBorders>
+              <w:start w:sz="3.1999999999999886" w:val="single" w:color="#000000"/>
+              <w:top w:sz="3.199999999999818" w:val="single" w:color="#000000"/>
+              <w:end w:sz="3.199999999999818" w:val="single" w:color="#000000"/>
+              <w:bottom w:sz="4.0" w:val="single" w:color="#000000"/>
+            </w:tcBorders>
+            <w:shd w:fill="f1f2f1"/>
+            <w:tcMar>
+              <w:start w:w="0" w:type="dxa"/>
+              <w:end w:w="0" w:type="dxa"/>
+            </w:tcMar>
+          </w:tcPr>
+          <w:p>
+            <w:pPr>
+              <w:autoSpaceDN w:val="0"/>
+              <w:autoSpaceDE w:val="0"/>
+              <w:widowControl/>
+              <w:spacing w:line="194" w:lineRule="auto" w:before="128" w:after="0"/>
+              <w:ind w:left="104" w:right="0" w:firstLine="0"/>
+              <w:jc w:val="left"/>
+            </w:pPr>
+            <w:r>
+              <w:rPr>
+                <w:rFonts w:ascii="Calibri" w:hAnsi="Calibri" w:eastAsia="Calibri"/>
+                <w:b/>
+                <w:i w:val="0"/>
+                <w:color w:val="000000"/>
+                <w:sz w:val="20"/>
+              </w:rPr>
+              <w:t xml:space="preserve">Authorized Signature </w:t>
+            </w:r>
+          </w:p>
+        </w:tc>
+        <w:tc>
+          <w:tcPr>
+            <w:tcW w:type="dxa" w:w="2614"/>
+            <w:tcBorders>
+              <w:start w:sz="3.199999999999818" w:val="single" w:color="#000000"/>
+              <w:top w:sz="3.199999999999818" w:val="single" w:color="#000000"/>
+              <w:end w:sz="3.199999999999818" w:val="single" w:color="#000000"/>
+              <w:bottom w:sz="4.0" w:val="single" w:color="#000000"/>
+            </w:tcBorders>
+            <w:tcMar>
+              <w:start w:w="0" w:type="dxa"/>
+              <w:end w:w="0" w:type="dxa"/>
+            </w:tcMar>
+          </w:tcPr>
+          <w:p/>
+        </w:tc>
+        <w:tc>
+          <w:tcPr>
+            <w:tcW w:type="dxa" w:w="2618"/>
+            <w:tcBorders>
+              <w:start w:sz="3.199999999999818" w:val="single" w:color="#000000"/>
+              <w:top w:sz="3.199999999999818" w:val="single" w:color="#000000"/>
+              <w:end w:sz="4.0" w:val="single" w:color="#000000"/>
+              <w:bottom w:sz="4.0" w:val="single" w:color="#000000"/>
+            </w:tcBorders>
+            <w:shd w:fill="f1f2f1"/>
+            <w:tcMar>
+              <w:start w:w="0" w:type="dxa"/>
+              <w:end w:w="0" w:type="dxa"/>
+            </w:tcMar>
+          </w:tcPr>
+          <w:p>
+            <w:pPr>
+              <w:autoSpaceDN w:val="0"/>
+              <w:autoSpaceDE w:val="0"/>
+              <w:widowControl/>
+              <w:spacing w:line="194" w:lineRule="auto" w:before="128" w:after="0"/>
+              <w:ind w:left="104" w:right="0" w:firstLine="0"/>
+              <w:jc w:val="left"/>
+            </w:pPr>
+            <w:r>
+              <w:rPr>
+                <w:rFonts w:ascii="Calibri" w:hAnsi="Calibri" w:eastAsia="Calibri"/>
+                <w:b/>
+                <w:i w:val="0"/>
+                <w:color w:val="000000"/>
+                <w:sz w:val="20"/>
+              </w:rPr>
+              <w:t xml:space="preserve">Date </w:t>
+            </w:r>
+          </w:p>
+        </w:tc>
+        <w:tc>
+          <w:tcPr>
+            <w:tcW w:type="dxa" w:w="2682"/>
+            <w:tcBorders>
+              <w:start w:sz="4.0" w:val="single" w:color="#000000"/>
+              <w:top w:sz="3.199999999999818" w:val="single" w:color="#000000"/>
+              <w:end w:sz="4.0" w:val="single" w:color="#000000"/>
+              <w:bottom w:sz="4.0" w:val="single" w:color="#000000"/>
+            </w:tcBorders>
+            <w:tcMar>
+              <w:start w:w="0" w:type="dxa"/>
+              <w:end w:w="0" w:type="dxa"/>
+            </w:tcMar>
+          </w:tcPr>
+          <w:p/>
+        </w:tc>
+      </w:tr>
+    </w:tbl>
+    <w:p>
+      <w:pPr>
+        <w:autoSpaceDN w:val="0"/>
+        <w:autoSpaceDE w:val="0"/>
+        <w:widowControl/>
+        <w:spacing w:line="240" w:lineRule="auto" w:before="492" w:after="356"/>
+        <w:ind w:left="0" w:right="0" w:firstLine="0"/>
+        <w:jc w:val="left"/>
+      </w:pPr>
+      <w:r>
+        <w:drawing>
+          <wp:inline xmlns:a="http://schemas.openxmlformats.org/drawingml/2006/main" xmlns:pic="http://schemas.openxmlformats.org/drawingml/2006/picture">
+            <wp:extent cx="6616700" cy="203200"/>
+            <wp:docPr id="3" name="Picture 3"/>
+            <wp:cNvGraphicFramePr>
+              <a:graphicFrameLocks noChangeAspect="1"/>
+            </wp:cNvGraphicFramePr>
+            <a:graphic>
+              <a:graphicData uri="http://schemas.openxmlformats.org/drawingml/2006/picture">
+                <pic:pic>
+                  <pic:nvPicPr>
+                    <pic:cNvPr id="0" name="image.png"/>
+                    <pic:cNvPicPr/>
+                  </pic:nvPicPr>
+                  <pic:blipFill>
+                    <a:blip r:embed="rId11"/>
+                    <a:stretch>
+                      <a:fillRect/>
+                    </a:stretch>
+                  </pic:blipFill>
+                  <pic:spPr>
+                    <a:xfrm>
+                      <a:off x="0" y="0"/>
+                      <a:ext cx="6616700" cy="203200"/>
+                    </a:xfrm>
+                    <a:prstGeom prst="rect"/>
+                  </pic:spPr>
+                </pic:pic>
+              </a:graphicData>
+            </a:graphic>
+          </wp:inline>
+        </w:drawing>
+      </w:r>
+    </w:p>
+    <w:tbl>
+      <w:tblPr>
+        <w:tblW w:type="auto" w:w="0"/>
+        <w:tblLayout w:type="fixed"/>
+        <w:tblLook w:firstColumn="1" w:firstRow="1" w:lastColumn="0" w:lastRow="0" w:noHBand="0" w:noVBand="1" w:val="04A0"/>
+        <w:tblInd w:w="620.0" w:type="dxa"/>
+      </w:tblPr>
+      <w:tblGrid>
+        <w:gridCol w:w="1504"/>
+        <w:gridCol w:w="1504"/>
+        <w:gridCol w:w="1504"/>
+        <w:gridCol w:w="1504"/>
+        <w:gridCol w:w="1504"/>
+        <w:gridCol w:w="1504"/>
+      </w:tblGrid>
+      <w:tr>
+        <w:trPr>
+          <w:trHeight w:hRule="exact" w:val="292"/>
+        </w:trPr>
+        <w:tc>
+          <w:tcPr>
+            <w:tcW w:type="dxa" w:w="1080"/>
+            <w:vMerge w:val="restart"/>
+            <w:tcBorders/>
+            <w:tcMar>
+              <w:start w:w="0" w:type="dxa"/>
+              <w:end w:w="0" w:type="dxa"/>
+            </w:tcMar>
+            <w:tcMar>
+              <w:start w:w="0" w:type="dxa"/>
+              <w:end w:w="0" w:type="dxa"/>
+            </w:tcMar>
+          </w:tcPr>
+          <w:p>
+            <w:pPr>
+              <w:autoSpaceDN w:val="0"/>
+              <w:autoSpaceDE w:val="0"/>
+              <w:widowControl/>
+              <w:spacing w:line="240" w:lineRule="auto" w:before="110" w:after="0"/>
+              <w:ind w:left="0" w:right="40" w:firstLine="0"/>
+              <w:jc w:val="right"/>
+            </w:pPr>
+            <w:r>
+              <w:drawing>
+                <wp:inline xmlns:a="http://schemas.openxmlformats.org/drawingml/2006/main" xmlns:pic="http://schemas.openxmlformats.org/drawingml/2006/picture">
+                  <wp:extent cx="251459" cy="252730"/>
+                  <wp:docPr id="4" name="Picture 4"/>
+                  <wp:cNvGraphicFramePr>
+                    <a:graphicFrameLocks noChangeAspect="1"/>
+                  </wp:cNvGraphicFramePr>
+                  <a:graphic>
+                    <a:graphicData uri="http://schemas.openxmlformats.org/drawingml/2006/picture">
+                      <pic:pic>
+                        <pic:nvPicPr>
+                          <pic:cNvPr id="0" name="image.png"/>
+                          <pic:cNvPicPr/>
+                        </pic:nvPicPr>
+                        <pic:blipFill>
+                          <a:blip r:embed="rId12"/>
+                          <a:stretch>
+                            <a:fillRect/>
+                          </a:stretch>
+                        </pic:blipFill>
+                        <pic:spPr>
+                          <a:xfrm>
+                            <a:off x="0" y="0"/>
+                            <a:ext cx="251459" cy="252730"/>
+                          </a:xfrm>
+                          <a:prstGeom prst="rect"/>
+                        </pic:spPr>
+                      </pic:pic>
+                    </a:graphicData>
+                  </a:graphic>
+                </wp:inline>
+              </w:drawing>
+            </w:r>
+          </w:p>
+        </w:tc>
+        <w:tc>
+          <w:tcPr>
+            <w:tcW w:type="dxa" w:w="2460"/>
+            <w:vMerge w:val="restart"/>
+            <w:tcBorders/>
+            <w:tcMar>
+              <w:start w:w="0" w:type="dxa"/>
+              <w:end w:w="0" w:type="dxa"/>
+            </w:tcMar>
+            <w:tcMar>
+              <w:start w:w="0" w:type="dxa"/>
+              <w:end w:w="0" w:type="dxa"/>
+            </w:tcMar>
+          </w:tcPr>
+          <w:p>
+            <w:pPr>
+              <w:autoSpaceDN w:val="0"/>
+              <w:autoSpaceDE w:val="0"/>
+              <w:widowControl/>
+              <w:spacing w:line="197" w:lineRule="auto" w:before="248" w:after="0"/>
+              <w:ind w:left="48" w:right="0" w:firstLine="0"/>
+              <w:jc w:val="left"/>
+            </w:pPr>
+            <w:r>
+              <w:rPr>
+                <w:rFonts w:ascii="Calibri" w:hAnsi="Calibri" w:eastAsia="Calibri"/>
+                <w:b w:val="0"/>
+                <w:i w:val="0"/>
+                <w:color w:val="A09F9F"/>
+                <w:sz w:val="16"/>
+              </w:rPr>
+              <w:t>Abu Dhabi, United Arab Emirates</w:t>
+            </w:r>
+          </w:p>
+        </w:tc>
+        <w:tc>
+          <w:tcPr>
+            <w:tcW w:type="dxa" w:w="980"/>
+            <w:vMerge w:val="restart"/>
+            <w:tcBorders/>
+            <w:tcMar>
+              <w:start w:w="0" w:type="dxa"/>
+              <w:end w:w="0" w:type="dxa"/>
+            </w:tcMar>
+            <w:tcMar>
+              <w:start w:w="0" w:type="dxa"/>
+              <w:end w:w="0" w:type="dxa"/>
+            </w:tcMar>
+          </w:tcPr>
+          <w:p>
+            <w:pPr>
+              <w:autoSpaceDN w:val="0"/>
+              <w:autoSpaceDE w:val="0"/>
+              <w:widowControl/>
+              <w:spacing w:line="240" w:lineRule="auto" w:before="78" w:after="0"/>
+              <w:ind w:left="0" w:right="112" w:firstLine="0"/>
+              <w:jc w:val="right"/>
+            </w:pPr>
+            <w:r>
+              <w:drawing>
+                <wp:inline xmlns:a="http://schemas.openxmlformats.org/drawingml/2006/main" xmlns:pic="http://schemas.openxmlformats.org/drawingml/2006/picture">
+                  <wp:extent cx="251460" cy="252729"/>
+                  <wp:docPr id="5" name="Picture 5"/>
+                  <wp:cNvGraphicFramePr>
+                    <a:graphicFrameLocks noChangeAspect="1"/>
+                  </wp:cNvGraphicFramePr>
+                  <a:graphic>
+                    <a:graphicData uri="http://schemas.openxmlformats.org/drawingml/2006/picture">
+                      <pic:pic>
+                        <pic:nvPicPr>
+                          <pic:cNvPr id="0" name="image.png"/>
+                          <pic:cNvPicPr/>
+                        </pic:nvPicPr>
+                        <pic:blipFill>
+                          <a:blip r:embed="rId13"/>
+                          <a:stretch>
+                            <a:fillRect/>
+                          </a:stretch>
+                        </pic:blipFill>
+                        <pic:spPr>
+                          <a:xfrm>
+                            <a:off x="0" y="0"/>
+                            <a:ext cx="251460" cy="252729"/>
+                          </a:xfrm>
+                          <a:prstGeom prst="rect"/>
+                        </pic:spPr>
+                      </pic:pic>
+                    </a:graphicData>
+                  </a:graphic>
+                </wp:inline>
+              </w:drawing>
+            </w:r>
+          </w:p>
+        </w:tc>
+        <w:tc>
+          <w:tcPr>
+            <w:tcW w:type="dxa" w:w="2200"/>
+            <w:tcBorders/>
+            <w:tcMar>
+              <w:start w:w="0" w:type="dxa"/>
+              <w:end w:w="0" w:type="dxa"/>
+            </w:tcMar>
+          </w:tcPr>
+          <w:p>
+            <w:pPr>
+              <w:autoSpaceDN w:val="0"/>
+              <w:autoSpaceDE w:val="0"/>
+              <w:widowControl/>
+              <w:spacing w:line="175" w:lineRule="auto" w:before="48" w:after="0"/>
+              <w:ind w:left="136" w:right="0" w:firstLine="0"/>
+              <w:jc w:val="left"/>
+            </w:pPr>
+            <w:r>
+              <w:rPr>
+                <w:rFonts w:ascii="Myanmar Text" w:hAnsi="Myanmar Text" w:eastAsia="Myanmar Text"/>
+                <w:b w:val="0"/>
+                <w:i w:val="0"/>
+                <w:color w:val="A09F9F"/>
+                <w:sz w:val="18"/>
+              </w:rPr>
+              <w:hyperlink r:id="rId14" w:history="1">
+                <w:r>
+                  <w:rPr>
+                    <w:rStyle w:val="Hyperlink"/>
+                  </w:rPr>
+                  <w:t>info@gss-group.net</w:t>
+                </w:r>
+              </w:hyperlink>
+            </w:r>
+          </w:p>
+        </w:tc>
+        <w:tc>
+          <w:tcPr>
+            <w:tcW w:type="dxa" w:w="1120"/>
+            <w:vMerge w:val="restart"/>
+            <w:tcBorders/>
+            <w:tcMar>
+              <w:start w:w="0" w:type="dxa"/>
+              <w:end w:w="0" w:type="dxa"/>
+            </w:tcMar>
+            <w:tcMar>
+              <w:start w:w="0" w:type="dxa"/>
+              <w:end w:w="0" w:type="dxa"/>
+            </w:tcMar>
+          </w:tcPr>
+          <w:p>
+            <w:pPr>
+              <w:autoSpaceDN w:val="0"/>
+              <w:autoSpaceDE w:val="0"/>
+              <w:widowControl/>
+              <w:spacing w:line="240" w:lineRule="auto" w:before="92" w:after="0"/>
+              <w:ind w:left="0" w:right="76" w:firstLine="0"/>
+              <w:jc w:val="right"/>
+            </w:pPr>
+            <w:r>
+              <w:drawing>
+                <wp:inline xmlns:a="http://schemas.openxmlformats.org/drawingml/2006/main" xmlns:pic="http://schemas.openxmlformats.org/drawingml/2006/picture">
+                  <wp:extent cx="251460" cy="252729"/>
+                  <wp:docPr id="6" name="Picture 6"/>
+                  <wp:cNvGraphicFramePr>
+                    <a:graphicFrameLocks noChangeAspect="1"/>
+                  </wp:cNvGraphicFramePr>
+                  <a:graphic>
+                    <a:graphicData uri="http://schemas.openxmlformats.org/drawingml/2006/picture">
+                      <pic:pic>
+                        <pic:nvPicPr>
+                          <pic:cNvPr id="0" name="image.png"/>
+                          <pic:cNvPicPr/>
+                        </pic:nvPicPr>
+                        <pic:blipFill>
+                          <a:blip r:embed="rId15"/>
+                          <a:stretch>
+                            <a:fillRect/>
+                          </a:stretch>
+                        </pic:blipFill>
+                        <pic:spPr>
+                          <a:xfrm>
+                            <a:off x="0" y="0"/>
+                            <a:ext cx="251460" cy="252729"/>
+                          </a:xfrm>
+                          <a:prstGeom prst="rect"/>
+                        </pic:spPr>
+                      </pic:pic>
+                    </a:graphicData>
+                  </a:graphic>
+                </wp:inline>
+              </w:drawing>
+            </w:r>
+          </w:p>
+        </w:tc>
+        <w:tc>
+          <w:tcPr>
+            <w:tcW w:type="dxa" w:w="2600"/>
+            <w:tcBorders/>
+            <w:tcMar>
+              <w:start w:w="0" w:type="dxa"/>
+              <w:end w:w="0" w:type="dxa"/>
+            </w:tcMar>
+          </w:tcPr>
+          <w:p>
+            <w:pPr>
+              <w:autoSpaceDN w:val="0"/>
+              <w:autoSpaceDE w:val="0"/>
+              <w:widowControl/>
+              <w:spacing w:line="175" w:lineRule="auto" w:before="46" w:after="0"/>
+              <w:ind w:left="112" w:right="0" w:firstLine="0"/>
+              <w:jc w:val="left"/>
+            </w:pPr>
+            <w:r>
+              <w:rPr>
+                <w:rFonts w:ascii="Myanmar Text" w:hAnsi="Myanmar Text" w:eastAsia="Myanmar Text"/>
+                <w:b w:val="0"/>
+                <w:i w:val="0"/>
+                <w:color w:val="A09F9F"/>
+                <w:sz w:val="18"/>
+              </w:rPr>
+              <w:t>Phone: +9712 6666898</w:t>
+            </w:r>
+          </w:p>
+        </w:tc>
+      </w:tr>
+      <w:tr>
+        <w:trPr>
+          <w:trHeight w:hRule="exact" w:val="220"/>
+        </w:trPr>
+        <w:tc>
+          <w:tcPr>
+            <w:tcW w:type="dxa" w:w="1504"/>
+            <w:vMerge/>
+            <w:tcBorders/>
+          </w:tcPr>
+          <w:p/>
+        </w:tc>
+        <w:tc>
+          <w:tcPr>
+            <w:tcW w:type="dxa" w:w="1504"/>
+            <w:vMerge/>
+            <w:tcBorders/>
+          </w:tcPr>
+          <w:p/>
+        </w:tc>
+        <w:tc>
+          <w:tcPr>
+            <w:tcW w:type="dxa" w:w="1504"/>
+            <w:vMerge/>
+            <w:tcBorders/>
+          </w:tcPr>
+          <w:p/>
+        </w:tc>
+        <w:tc>
+          <w:tcPr>
+            <w:tcW w:type="dxa" w:w="2200"/>
+            <w:tcBorders/>
+            <w:tcMar>
+              <w:start w:w="0" w:type="dxa"/>
+              <w:end w:w="0" w:type="dxa"/>
+            </w:tcMar>
+          </w:tcPr>
+          <w:p>
+            <w:pPr>
+              <w:autoSpaceDN w:val="0"/>
+              <w:autoSpaceDE w:val="0"/>
+              <w:widowControl/>
+              <w:spacing w:line="175" w:lineRule="auto" w:before="0" w:after="0"/>
+              <w:ind w:left="152" w:right="0" w:firstLine="0"/>
+              <w:jc w:val="left"/>
+            </w:pPr>
+            <w:r>
+              <w:rPr>
+                <w:rFonts w:ascii="Myanmar Text" w:hAnsi="Myanmar Text" w:eastAsia="Myanmar Text"/>
+                <w:b w:val="0"/>
+                <w:i w:val="0"/>
+                <w:color w:val="A09F9F"/>
+                <w:sz w:val="18"/>
+              </w:rPr>
+              <w:hyperlink r:id="rId14" w:history="1">
+                <w:r>
+                  <w:rPr>
+                    <w:rStyle w:val="Hyperlink"/>
+                  </w:rPr>
+                  <w:t>www.gss-group.net</w:t>
+                </w:r>
+              </w:hyperlink>
+            </w:r>
+          </w:p>
+        </w:tc>
+        <w:tc>
+          <w:tcPr>
+            <w:tcW w:type="dxa" w:w="1504"/>
+            <w:vMerge/>
+            <w:tcBorders/>
+          </w:tcPr>
+          <w:p/>
+        </w:tc>
+        <w:tc>
+          <w:tcPr>
+            <w:tcW w:type="dxa" w:w="2600"/>
+            <w:tcBorders/>
+            <w:tcMar>
+              <w:start w:w="0" w:type="dxa"/>
+              <w:end w:w="0" w:type="dxa"/>
+            </w:tcMar>
+          </w:tcPr>
+          <w:p>
+            <w:pPr>
+              <w:autoSpaceDN w:val="0"/>
+              <w:autoSpaceDE w:val="0"/>
+              <w:widowControl/>
+              <w:spacing w:line="240" w:lineRule="auto" w:before="0" w:after="0"/>
+              <w:ind w:left="112" w:right="0" w:firstLine="0"/>
+              <w:jc w:val="left"/>
+            </w:pPr>
+            <w:r>
+              <w:rPr>
+                <w:rFonts w:ascii="Gill Sans MT" w:hAnsi="Gill Sans MT" w:eastAsia="Gill Sans MT"/>
+                <w:b w:val="0"/>
+                <w:i w:val="0"/>
+                <w:color w:val="A09F9F"/>
+                <w:sz w:val="19"/>
+              </w:rPr>
+              <w:t>Fax: +971 2 666 8980</w:t>
             </w:r>
           </w:p>
         </w:tc>
       </w:tr>
     </w:tbl>
+    <w:p>
+      <w:pPr>
+        <w:autoSpaceDN w:val="0"/>
+        <w:autoSpaceDE w:val="0"/>
+        <w:widowControl/>
+        <w:spacing w:line="14" w:lineRule="exact" w:before="0" w:after="0"/>
+        <w:ind w:left="0" w:right="0"/>
+      </w:pPr>
+    </w:p>
     <w:sectPr>
-      <w:pgSz w:w="12240" w:h="15840"/>
-      <w:pgMar w:top="1440" w:right="1800" w:bottom="1440" w:left="1800" w:header="720" w:footer="720" w:gutter="0"/>
-      <w:cols w:space="720"/>
+      <w:pgSz w:w="11906" w:h="16838"/>
+      <w:pgMar w:top="300" w:right="0" w:bottom="226" w:left="0" w:header="720" w:footer="720" w:gutter="0"/>
+      <w:cols/>
       <w:docGrid w:linePitch="360"/>
     </w:sectPr>
   </w:body>
@@ -947,10 +4504,6 @@
     <w:name w:val="Normal"/>
     <w:qFormat/>
     <w:rsid w:val="00FC693F"/>
-    <w:rPr>
-      <w:rFonts w:ascii="Arial" w:hAnsi="Arial"/>
-      <w:sz w:val="20"/>
-    </w:rPr>
   </w:style>
   <w:style w:type="paragraph" w:styleId="Header">
     <w:name w:val="header"/>

</xml_diff>

<commit_message>
Fit filled HR form cells and signatures
</commit_message>
<xml_diff>
--- a/backend/templates/GSSG-HR_300-001_Manpower_Requisition_Form.docx
+++ b/backend/templates/GSSG-HR_300-001_Manpower_Requisition_Form.docx
@@ -589,7 +589,7 @@
       </w:tr>
       <w:tr>
         <w:trPr>
-          <w:trHeight w:hRule="exact" w:val="412"/>
+          <w:trHeight w:hRule="exact" w:val="317"/>
         </w:trPr>
         <w:tc>
           <w:tcPr>
@@ -671,7 +671,7 @@
       </w:tr>
       <w:tr>
         <w:trPr>
-          <w:trHeight w:hRule="exact" w:val="412"/>
+          <w:trHeight w:hRule="exact" w:val="317"/>
         </w:trPr>
         <w:tc>
           <w:tcPr>
@@ -1023,7 +1023,7 @@
       </w:tr>
       <w:tr>
         <w:trPr>
-          <w:trHeight w:hRule="exact" w:val="414"/>
+          <w:trHeight w:hRule="exact" w:val="317"/>
         </w:trPr>
         <w:tc>
           <w:tcPr>
@@ -1206,7 +1206,7 @@
       </w:tr>
       <w:tr>
         <w:trPr>
-          <w:trHeight w:hRule="exact" w:val="412"/>
+          <w:trHeight w:hRule="exact" w:val="317"/>
         </w:trPr>
         <w:tc>
           <w:tcPr>
@@ -1323,7 +1323,7 @@
       </w:tr>
       <w:tr>
         <w:trPr>
-          <w:trHeight w:hRule="exact" w:val="412"/>
+          <w:trHeight w:hRule="exact" w:val="317"/>
         </w:trPr>
         <w:tc>
           <w:tcPr>
@@ -1389,7 +1389,7 @@
       </w:tr>
       <w:tr>
         <w:trPr>
-          <w:trHeight w:hRule="exact" w:val="416"/>
+          <w:trHeight w:hRule="exact" w:val="317"/>
         </w:trPr>
         <w:tc>
           <w:tcPr>
@@ -1471,7 +1471,7 @@
       </w:tr>
       <w:tr>
         <w:trPr>
-          <w:trHeight w:hRule="exact" w:val="414"/>
+          <w:trHeight w:hRule="exact" w:val="317"/>
         </w:trPr>
         <w:tc>
           <w:tcPr>
@@ -1553,7 +1553,7 @@
       </w:tr>
       <w:tr>
         <w:trPr>
-          <w:trHeight w:hRule="exact" w:val="410"/>
+          <w:trHeight w:hRule="exact" w:val="317"/>
         </w:trPr>
         <w:tc>
           <w:tcPr>
@@ -1635,7 +1635,7 @@
       </w:tr>
       <w:tr>
         <w:trPr>
-          <w:trHeight w:hRule="exact" w:val="414"/>
+          <w:trHeight w:hRule="exact" w:val="317"/>
         </w:trPr>
         <w:tc>
           <w:tcPr>
@@ -1809,7 +1809,7 @@
       </w:tr>
       <w:tr>
         <w:trPr>
-          <w:trHeight w:hRule="exact" w:val="776"/>
+          <w:trHeight w:hRule="atLeast" w:val="389"/>
         </w:trPr>
         <w:tc>
           <w:tcPr>
@@ -1891,7 +1891,7 @@
       </w:tr>
       <w:tr>
         <w:trPr>
-          <w:trHeight w:hRule="exact" w:val="416"/>
+          <w:trHeight w:hRule="atLeast" w:val="346"/>
         </w:trPr>
         <w:tc>
           <w:tcPr>
@@ -1973,7 +1973,7 @@
       </w:tr>
       <w:tr>
         <w:trPr>
-          <w:trHeight w:hRule="exact" w:val="420"/>
+          <w:trHeight w:hRule="atLeast" w:val="420"/>
         </w:trPr>
         <w:tc>
           <w:tcPr>
@@ -2055,7 +2055,7 @@
       </w:tr>
       <w:tr>
         <w:trPr>
-          <w:trHeight w:hRule="exact" w:val="506"/>
+          <w:trHeight w:hRule="atLeast" w:val="605"/>
         </w:trPr>
         <w:tc>
           <w:tcPr>
@@ -2396,7 +2396,7 @@
       </w:tr>
       <w:tr>
         <w:trPr>
-          <w:trHeight w:hRule="exact" w:val="498"/>
+          <w:trHeight w:hRule="atLeast" w:val="432"/>
         </w:trPr>
         <w:tc>
           <w:tcPr>
@@ -2717,7 +2717,7 @@
       </w:tr>
       <w:tr>
         <w:trPr>
-          <w:trHeight w:hRule="exact" w:val="500"/>
+          <w:trHeight w:hRule="atLeast" w:val="500"/>
         </w:trPr>
         <w:tc>
           <w:tcPr>
@@ -2815,6 +2815,7 @@
         <w:widowControl/>
         <w:spacing w:line="242" w:lineRule="exact" w:before="0" w:after="0"/>
         <w:ind w:left="0" w:right="0"/>
+        <w:pageBreakBefore/>
       </w:pPr>
     </w:p>
     <w:tbl>
@@ -3016,7 +3017,7 @@
       </w:tr>
       <w:tr>
         <w:trPr>
-          <w:trHeight w:hRule="exact" w:val="412"/>
+          <w:trHeight w:hRule="atLeast" w:val="403"/>
         </w:trPr>
         <w:tc>
           <w:tcPr>
@@ -3113,7 +3114,7 @@
       </w:tr>
       <w:tr>
         <w:trPr>
-          <w:trHeight w:hRule="exact" w:val="408"/>
+          <w:trHeight w:hRule="exact" w:val="403"/>
         </w:trPr>
         <w:tc>
           <w:tcPr>
@@ -3202,7 +3203,7 @@
       </w:tr>
       <w:tr>
         <w:trPr>
-          <w:trHeight w:hRule="exact" w:val="408"/>
+          <w:trHeight w:hRule="exact" w:val="403"/>
         </w:trPr>
         <w:tc>
           <w:tcPr>
@@ -3291,7 +3292,7 @@
       </w:tr>
       <w:tr>
         <w:trPr>
-          <w:trHeight w:hRule="exact" w:val="410"/>
+          <w:trHeight w:hRule="exact" w:val="403"/>
         </w:trPr>
         <w:tc>
           <w:tcPr>
@@ -3457,7 +3458,7 @@
       </w:tr>
       <w:tr>
         <w:trPr>
-          <w:trHeight w:hRule="exact" w:val="428"/>
+          <w:trHeight w:hRule="exact" w:val="418"/>
         </w:trPr>
         <w:tc>
           <w:tcPr>
@@ -3566,7 +3567,7 @@
       </w:tr>
       <w:tr>
         <w:trPr>
-          <w:trHeight w:hRule="exact" w:val="424"/>
+          <w:trHeight w:hRule="exact" w:val="418"/>
         </w:trPr>
         <w:tc>
           <w:tcPr>
@@ -3679,7 +3680,7 @@
         <w:autoSpaceDN w:val="0"/>
         <w:autoSpaceDE w:val="0"/>
         <w:widowControl/>
-        <w:spacing w:line="240" w:lineRule="auto" w:before="492" w:after="356"/>
+        <w:spacing w:line="20" w:lineRule="exact" w:before="0" w:after="0"/>
         <w:ind w:left="0" w:right="0" w:firstLine="0"/>
         <w:jc w:val="left"/>
       </w:pPr>

</xml_diff>